<commit_message>
fixed some bugs and added unit tests
</commit_message>
<xml_diff>
--- a/BlogPost Application.docx
+++ b/BlogPost Application.docx
@@ -263,134 +263,6 @@
       </w:pPr>
       <w:r>
         <w:rPr/>
-        <w:t xml:space="preserve">So for any reason if we </w:t>
-      </w:r>
-      <w:r>
-        <w:rPr>
-          <w:b/>
-        </w:rPr>
-        <w:t xml:space="preserve">don’t have Kafka running </w:t>
-      </w:r>
-      <w:r>
-        <w:rPr/>
-        <w:t>still you</w:t>
-      </w:r>
-      <w:r>
-        <w:rPr>
-          <w:b/>
-        </w:rPr>
-        <w:t xml:space="preserve"> can run the</w:t>
-      </w:r>
-      <w:r>
-        <w:rPr/>
-        <w:t xml:space="preserve"> </w:t>
-      </w:r>
-      <w:r>
-        <w:rPr>
-          <w:b/>
-        </w:rPr>
-        <w:t>Blogging_Platform</w:t>
-      </w:r>
-      <w:r>
-        <w:rPr/>
-        <w:t>. You will get some errors only,</w:t>
-      </w:r>
-    </w:p>
-    <w:p>
-      <w:pPr>
-        <w:pStyle w:val="normal1"/>
-        <w:rPr/>
-      </w:pPr>
-      <w:r>
-        <w:rPr/>
-      </w:r>
-    </w:p>
-    <w:p>
-      <w:pPr>
-        <w:pStyle w:val="normal1"/>
-        <w:rPr/>
-      </w:pPr>
-      <w:r>
-        <w:rPr/>
-        <w:drawing>
-          <wp:inline distT="0" distB="0" distL="0" distR="0">
-            <wp:extent cx="5731510" cy="2235200"/>
-            <wp:effectExtent l="0" t="0" r="0" b="0"/>
-            <wp:docPr id="1" name="image1.png" descr=""/>
-            <wp:cNvGraphicFramePr>
-              <a:graphicFrameLocks xmlns:a="http://schemas.openxmlformats.org/drawingml/2006/main" noChangeAspect="1"/>
-            </wp:cNvGraphicFramePr>
-            <a:graphic xmlns:a="http://schemas.openxmlformats.org/drawingml/2006/main">
-              <a:graphicData uri="http://schemas.openxmlformats.org/drawingml/2006/picture">
-                <pic:pic xmlns:pic="http://schemas.openxmlformats.org/drawingml/2006/picture">
-                  <pic:nvPicPr>
-                    <pic:cNvPr id="1" name="image1.png" descr=""/>
-                    <pic:cNvPicPr>
-                      <a:picLocks noChangeAspect="1" noChangeArrowheads="1"/>
-                    </pic:cNvPicPr>
-                  </pic:nvPicPr>
-                  <pic:blipFill>
-                    <a:blip r:embed="rId2"/>
-                    <a:stretch>
-                      <a:fillRect/>
-                    </a:stretch>
-                  </pic:blipFill>
-                  <pic:spPr bwMode="auto">
-                    <a:xfrm>
-                      <a:off x="0" y="0"/>
-                      <a:ext cx="5731510" cy="2235200"/>
-                    </a:xfrm>
-                    <a:prstGeom prst="rect">
-                      <a:avLst/>
-                    </a:prstGeom>
-                  </pic:spPr>
-                </pic:pic>
-              </a:graphicData>
-            </a:graphic>
-          </wp:inline>
-        </w:drawing>
-      </w:r>
-    </w:p>
-    <w:p>
-      <w:pPr>
-        <w:pStyle w:val="normal1"/>
-        <w:rPr/>
-      </w:pPr>
-      <w:r>
-        <w:rPr/>
-      </w:r>
-    </w:p>
-    <w:p>
-      <w:pPr>
-        <w:pStyle w:val="normal1"/>
-        <w:rPr/>
-      </w:pPr>
-      <w:r>
-        <w:rPr/>
-        <w:t xml:space="preserve">But you can ignore them and wait for the </w:t>
-      </w:r>
-      <w:r>
-        <w:rPr>
-          <w:rFonts w:eastAsia="Courier New" w:cs="Courier New" w:ascii="Courier New" w:hAnsi="Courier New"/>
-          <w:color w:val="EBEBEB"/>
-          <w:sz w:val="20"/>
-          <w:szCs w:val="20"/>
-          <w:shd w:fill="2F2F2F" w:val="clear"/>
-        </w:rPr>
-        <w:t xml:space="preserve"> Started  BloggingPlatformApplication </w:t>
-      </w:r>
-      <w:r>
-        <w:rPr/>
-        <w:t xml:space="preserve"> message .It will work and run all the APIs only. You will not be able to use Kafka Controller APIs.</w:t>
-      </w:r>
-    </w:p>
-    <w:p>
-      <w:pPr>
-        <w:pStyle w:val="normal1"/>
-        <w:rPr/>
-      </w:pPr>
-      <w:r>
-        <w:rPr/>
       </w:r>
     </w:p>
     <w:p>
@@ -511,10 +383,10 @@
         <w:pStyle w:val="normal1"/>
         <w:rPr/>
       </w:pPr>
-      <w:hyperlink r:id="rId3">
+      <w:hyperlink r:id="rId2">
         <w:r>
           <w:rPr>
-            <w:rStyle w:val="ListLabel82"/>
+            <w:rStyle w:val="ListLabel91"/>
             <w:color w:val="1155CC"/>
             <w:u w:val="single"/>
           </w:rPr>
@@ -688,11 +560,7 @@
       </w:pPr>
       <w:r>
         <w:rPr/>
-        <w:t>2)</w:t>
-      </w:r>
-      <w:r>
-        <w:rPr/>
-        <w:t xml:space="preserve">API - </w:t>
+        <w:t xml:space="preserve">2)API - </w:t>
       </w:r>
       <w:r>
         <w:rPr>
@@ -955,7 +823,6 @@
               <w:keepNext w:val="false"/>
               <w:keepLines w:val="false"/>
               <w:widowControl/>
-              <w:pBdr/>
               <w:shd w:val="clear" w:fill="auto"/>
               <w:spacing w:lineRule="auto" w:line="276" w:before="0" w:after="0"/>
               <w:ind w:hanging="0" w:left="0" w:right="0"/>
@@ -973,7 +840,6 @@
               <w:keepNext w:val="false"/>
               <w:keepLines w:val="false"/>
               <w:widowControl/>
-              <w:pBdr/>
               <w:shd w:val="clear" w:fill="auto"/>
               <w:spacing w:lineRule="auto" w:line="276" w:before="0" w:after="0"/>
               <w:ind w:hanging="0" w:left="0" w:right="0"/>
@@ -995,7 +861,6 @@
               <w:keepNext w:val="false"/>
               <w:keepLines w:val="false"/>
               <w:widowControl/>
-              <w:pBdr/>
               <w:shd w:val="clear" w:fill="auto"/>
               <w:spacing w:lineRule="auto" w:line="276" w:before="0" w:after="0"/>
               <w:ind w:hanging="0" w:left="0" w:right="0"/>
@@ -1017,7 +882,6 @@
               <w:keepNext w:val="false"/>
               <w:keepLines w:val="false"/>
               <w:widowControl/>
-              <w:pBdr/>
               <w:shd w:val="clear" w:fill="auto"/>
               <w:spacing w:lineRule="auto" w:line="276" w:before="0" w:after="0"/>
               <w:ind w:hanging="0" w:left="0" w:right="0"/>
@@ -1039,7 +903,6 @@
               <w:keepNext w:val="false"/>
               <w:keepLines w:val="false"/>
               <w:widowControl/>
-              <w:pBdr/>
               <w:shd w:val="clear" w:fill="auto"/>
               <w:spacing w:lineRule="auto" w:line="276" w:before="0" w:after="0"/>
               <w:ind w:hanging="0" w:left="0" w:right="0"/>
@@ -1061,7 +924,6 @@
               <w:keepNext w:val="false"/>
               <w:keepLines w:val="false"/>
               <w:widowControl/>
-              <w:pBdr/>
               <w:shd w:val="clear" w:fill="auto"/>
               <w:spacing w:lineRule="auto" w:line="276" w:before="0" w:after="0"/>
               <w:ind w:hanging="0" w:left="0" w:right="0"/>
@@ -1083,7 +945,6 @@
               <w:keepNext w:val="false"/>
               <w:keepLines w:val="false"/>
               <w:widowControl/>
-              <w:pBdr/>
               <w:shd w:val="clear" w:fill="auto"/>
               <w:spacing w:lineRule="auto" w:line="276" w:before="0" w:after="0"/>
               <w:ind w:hanging="0" w:left="0" w:right="0"/>
@@ -1105,7 +966,6 @@
               <w:keepNext w:val="false"/>
               <w:keepLines w:val="false"/>
               <w:widowControl/>
-              <w:pBdr/>
               <w:shd w:val="clear" w:fill="auto"/>
               <w:spacing w:lineRule="auto" w:line="276" w:before="0" w:after="0"/>
               <w:ind w:hanging="0" w:left="0" w:right="0"/>
@@ -1127,7 +987,6 @@
               <w:keepNext w:val="false"/>
               <w:keepLines w:val="false"/>
               <w:widowControl/>
-              <w:pBdr/>
               <w:shd w:val="clear" w:fill="auto"/>
               <w:spacing w:lineRule="auto" w:line="276" w:before="0" w:after="0"/>
               <w:ind w:hanging="0" w:left="0" w:right="0"/>
@@ -1149,7 +1008,6 @@
               <w:keepNext w:val="false"/>
               <w:keepLines w:val="false"/>
               <w:widowControl/>
-              <w:pBdr/>
               <w:shd w:val="clear" w:fill="auto"/>
               <w:spacing w:lineRule="auto" w:line="276" w:before="0" w:after="0"/>
               <w:ind w:hanging="0" w:left="0" w:right="0"/>
@@ -1171,7 +1029,6 @@
               <w:keepNext w:val="false"/>
               <w:keepLines w:val="false"/>
               <w:widowControl/>
-              <w:pBdr/>
               <w:shd w:val="clear" w:fill="auto"/>
               <w:spacing w:lineRule="auto" w:line="276" w:before="0" w:after="0"/>
               <w:ind w:hanging="0" w:left="0" w:right="0"/>
@@ -1193,7 +1050,6 @@
               <w:keepNext w:val="false"/>
               <w:keepLines w:val="false"/>
               <w:widowControl/>
-              <w:pBdr/>
               <w:shd w:val="clear" w:fill="auto"/>
               <w:spacing w:lineRule="auto" w:line="276" w:before="0" w:after="0"/>
               <w:ind w:hanging="0" w:left="0" w:right="0"/>
@@ -1215,7 +1071,6 @@
               <w:keepNext w:val="false"/>
               <w:keepLines w:val="false"/>
               <w:widowControl/>
-              <w:pBdr/>
               <w:shd w:val="clear" w:fill="auto"/>
               <w:spacing w:lineRule="auto" w:line="276" w:before="0" w:after="0"/>
               <w:ind w:hanging="0" w:left="0" w:right="0"/>
@@ -1237,7 +1092,6 @@
               <w:keepNext w:val="false"/>
               <w:keepLines w:val="false"/>
               <w:widowControl/>
-              <w:pBdr/>
               <w:shd w:val="clear" w:fill="auto"/>
               <w:spacing w:lineRule="auto" w:line="276" w:before="0" w:after="0"/>
               <w:ind w:hanging="0" w:left="0" w:right="0"/>
@@ -1255,7 +1109,6 @@
               <w:keepNext w:val="false"/>
               <w:keepLines w:val="false"/>
               <w:widowControl/>
-              <w:pBdr/>
               <w:shd w:val="clear" w:fill="auto"/>
               <w:spacing w:lineRule="auto" w:line="276" w:before="0" w:after="0"/>
               <w:ind w:hanging="0" w:left="0" w:right="0"/>
@@ -1272,7 +1125,6 @@
               <w:keepNext w:val="false"/>
               <w:keepLines w:val="false"/>
               <w:widowControl w:val="false"/>
-              <w:pBdr/>
               <w:shd w:val="clear" w:fill="auto"/>
               <w:spacing w:lineRule="auto" w:line="240" w:before="0" w:after="0"/>
               <w:ind w:hanging="0" w:left="0" w:right="0"/>
@@ -1311,11 +1163,7 @@
       </w:pPr>
       <w:r>
         <w:rPr/>
-        <w:t>3</w:t>
-      </w:r>
-      <w:r>
-        <w:rPr/>
-        <w:t xml:space="preserve">)You can also update your details later on </w:t>
+        <w:t xml:space="preserve">3)You can also update your details later on </w:t>
       </w:r>
     </w:p>
     <w:p>
@@ -1632,7 +1480,6 @@
               <w:keepNext w:val="false"/>
               <w:keepLines w:val="false"/>
               <w:widowControl w:val="false"/>
-              <w:pBdr/>
               <w:shd w:val="clear" w:fill="auto"/>
               <w:spacing w:lineRule="auto" w:line="240" w:before="0" w:after="0"/>
               <w:ind w:hanging="0" w:left="0" w:right="0"/>
@@ -1650,7 +1497,6 @@
               <w:keepNext w:val="false"/>
               <w:keepLines w:val="false"/>
               <w:widowControl w:val="false"/>
-              <w:pBdr/>
               <w:shd w:val="clear" w:fill="auto"/>
               <w:spacing w:lineRule="auto" w:line="240" w:before="0" w:after="0"/>
               <w:ind w:hanging="0" w:left="0" w:right="0"/>
@@ -1672,7 +1518,6 @@
               <w:keepNext w:val="false"/>
               <w:keepLines w:val="false"/>
               <w:widowControl w:val="false"/>
-              <w:pBdr/>
               <w:shd w:val="clear" w:fill="auto"/>
               <w:spacing w:lineRule="auto" w:line="240" w:before="0" w:after="0"/>
               <w:ind w:hanging="0" w:left="0" w:right="0"/>
@@ -1694,7 +1539,6 @@
               <w:keepNext w:val="false"/>
               <w:keepLines w:val="false"/>
               <w:widowControl w:val="false"/>
-              <w:pBdr/>
               <w:shd w:val="clear" w:fill="auto"/>
               <w:spacing w:lineRule="auto" w:line="240" w:before="0" w:after="0"/>
               <w:ind w:hanging="0" w:left="0" w:right="0"/>
@@ -1716,7 +1560,6 @@
               <w:keepNext w:val="false"/>
               <w:keepLines w:val="false"/>
               <w:widowControl w:val="false"/>
-              <w:pBdr/>
               <w:shd w:val="clear" w:fill="auto"/>
               <w:spacing w:lineRule="auto" w:line="240" w:before="0" w:after="0"/>
               <w:ind w:hanging="0" w:left="0" w:right="0"/>
@@ -1738,7 +1581,6 @@
               <w:keepNext w:val="false"/>
               <w:keepLines w:val="false"/>
               <w:widowControl w:val="false"/>
-              <w:pBdr/>
               <w:shd w:val="clear" w:fill="auto"/>
               <w:spacing w:lineRule="auto" w:line="240" w:before="0" w:after="0"/>
               <w:ind w:hanging="0" w:left="0" w:right="0"/>
@@ -1760,7 +1602,6 @@
               <w:keepNext w:val="false"/>
               <w:keepLines w:val="false"/>
               <w:widowControl w:val="false"/>
-              <w:pBdr/>
               <w:shd w:val="clear" w:fill="auto"/>
               <w:spacing w:lineRule="auto" w:line="240" w:before="0" w:after="0"/>
               <w:ind w:hanging="0" w:left="0" w:right="0"/>
@@ -1782,7 +1623,6 @@
               <w:keepNext w:val="false"/>
               <w:keepLines w:val="false"/>
               <w:widowControl w:val="false"/>
-              <w:pBdr/>
               <w:shd w:val="clear" w:fill="auto"/>
               <w:spacing w:lineRule="auto" w:line="240" w:before="0" w:after="0"/>
               <w:ind w:hanging="0" w:left="0" w:right="0"/>
@@ -1804,7 +1644,6 @@
               <w:keepNext w:val="false"/>
               <w:keepLines w:val="false"/>
               <w:widowControl w:val="false"/>
-              <w:pBdr/>
               <w:shd w:val="clear" w:fill="auto"/>
               <w:spacing w:lineRule="auto" w:line="240" w:before="0" w:after="0"/>
               <w:ind w:hanging="0" w:left="0" w:right="0"/>
@@ -1826,7 +1665,6 @@
               <w:keepNext w:val="false"/>
               <w:keepLines w:val="false"/>
               <w:widowControl w:val="false"/>
-              <w:pBdr/>
               <w:shd w:val="clear" w:fill="auto"/>
               <w:spacing w:lineRule="auto" w:line="240" w:before="0" w:after="0"/>
               <w:ind w:hanging="0" w:left="0" w:right="0"/>
@@ -1848,7 +1686,6 @@
               <w:keepNext w:val="false"/>
               <w:keepLines w:val="false"/>
               <w:widowControl w:val="false"/>
-              <w:pBdr/>
               <w:shd w:val="clear" w:fill="auto"/>
               <w:spacing w:lineRule="auto" w:line="240" w:before="0" w:after="0"/>
               <w:ind w:hanging="0" w:left="0" w:right="0"/>
@@ -1870,7 +1707,6 @@
               <w:keepNext w:val="false"/>
               <w:keepLines w:val="false"/>
               <w:widowControl w:val="false"/>
-              <w:pBdr/>
               <w:shd w:val="clear" w:fill="auto"/>
               <w:spacing w:lineRule="auto" w:line="240" w:before="0" w:after="0"/>
               <w:ind w:hanging="0" w:left="0" w:right="0"/>
@@ -1892,7 +1728,6 @@
               <w:keepNext w:val="false"/>
               <w:keepLines w:val="false"/>
               <w:widowControl w:val="false"/>
-              <w:pBdr/>
               <w:shd w:val="clear" w:fill="auto"/>
               <w:spacing w:lineRule="auto" w:line="240" w:before="0" w:after="0"/>
               <w:ind w:hanging="0" w:left="0" w:right="0"/>
@@ -1914,7 +1749,6 @@
               <w:keepNext w:val="false"/>
               <w:keepLines w:val="false"/>
               <w:widowControl w:val="false"/>
-              <w:pBdr/>
               <w:shd w:val="clear" w:fill="auto"/>
               <w:spacing w:lineRule="auto" w:line="240" w:before="0" w:after="0"/>
               <w:ind w:hanging="0" w:left="0" w:right="0"/>
@@ -1954,11 +1788,7 @@
       </w:pPr>
       <w:r>
         <w:rPr/>
-        <w:t>4</w:t>
-      </w:r>
-      <w:r>
-        <w:rPr/>
-        <w:t>)Get by user id</w:t>
+        <w:t>4)Get by user id</w:t>
       </w:r>
     </w:p>
     <w:p>
@@ -2016,7 +1846,6 @@
               <w:keepNext w:val="false"/>
               <w:keepLines w:val="false"/>
               <w:widowControl w:val="false"/>
-              <w:pBdr/>
               <w:shd w:val="clear" w:fill="auto"/>
               <w:spacing w:lineRule="auto" w:line="240" w:before="0" w:after="0"/>
               <w:ind w:hanging="0" w:left="0" w:right="0"/>
@@ -2034,7 +1863,6 @@
               <w:keepNext w:val="false"/>
               <w:keepLines w:val="false"/>
               <w:widowControl w:val="false"/>
-              <w:pBdr/>
               <w:shd w:val="clear" w:fill="auto"/>
               <w:spacing w:lineRule="auto" w:line="240" w:before="0" w:after="0"/>
               <w:ind w:hanging="0" w:left="0" w:right="0"/>
@@ -2056,7 +1884,6 @@
               <w:keepNext w:val="false"/>
               <w:keepLines w:val="false"/>
               <w:widowControl w:val="false"/>
-              <w:pBdr/>
               <w:shd w:val="clear" w:fill="auto"/>
               <w:spacing w:lineRule="auto" w:line="240" w:before="0" w:after="0"/>
               <w:ind w:hanging="0" w:left="0" w:right="0"/>
@@ -2078,7 +1905,6 @@
               <w:keepNext w:val="false"/>
               <w:keepLines w:val="false"/>
               <w:widowControl w:val="false"/>
-              <w:pBdr/>
               <w:shd w:val="clear" w:fill="auto"/>
               <w:spacing w:lineRule="auto" w:line="240" w:before="0" w:after="0"/>
               <w:ind w:hanging="0" w:left="0" w:right="0"/>
@@ -2100,7 +1926,6 @@
               <w:keepNext w:val="false"/>
               <w:keepLines w:val="false"/>
               <w:widowControl w:val="false"/>
-              <w:pBdr/>
               <w:shd w:val="clear" w:fill="auto"/>
               <w:spacing w:lineRule="auto" w:line="240" w:before="0" w:after="0"/>
               <w:ind w:hanging="0" w:left="0" w:right="0"/>
@@ -2122,7 +1947,6 @@
               <w:keepNext w:val="false"/>
               <w:keepLines w:val="false"/>
               <w:widowControl w:val="false"/>
-              <w:pBdr/>
               <w:shd w:val="clear" w:fill="auto"/>
               <w:spacing w:lineRule="auto" w:line="240" w:before="0" w:after="0"/>
               <w:ind w:hanging="0" w:left="0" w:right="0"/>
@@ -2144,7 +1968,6 @@
               <w:keepNext w:val="false"/>
               <w:keepLines w:val="false"/>
               <w:widowControl w:val="false"/>
-              <w:pBdr/>
               <w:shd w:val="clear" w:fill="auto"/>
               <w:spacing w:lineRule="auto" w:line="240" w:before="0" w:after="0"/>
               <w:ind w:hanging="0" w:left="0" w:right="0"/>
@@ -2166,7 +1989,6 @@
               <w:keepNext w:val="false"/>
               <w:keepLines w:val="false"/>
               <w:widowControl w:val="false"/>
-              <w:pBdr/>
               <w:shd w:val="clear" w:fill="auto"/>
               <w:spacing w:lineRule="auto" w:line="240" w:before="0" w:after="0"/>
               <w:ind w:hanging="0" w:left="0" w:right="0"/>
@@ -2188,7 +2010,6 @@
               <w:keepNext w:val="false"/>
               <w:keepLines w:val="false"/>
               <w:widowControl w:val="false"/>
-              <w:pBdr/>
               <w:shd w:val="clear" w:fill="auto"/>
               <w:spacing w:lineRule="auto" w:line="240" w:before="0" w:after="0"/>
               <w:ind w:hanging="0" w:left="0" w:right="0"/>
@@ -2210,7 +2031,6 @@
               <w:keepNext w:val="false"/>
               <w:keepLines w:val="false"/>
               <w:widowControl w:val="false"/>
-              <w:pBdr/>
               <w:shd w:val="clear" w:fill="auto"/>
               <w:spacing w:lineRule="auto" w:line="240" w:before="0" w:after="0"/>
               <w:ind w:hanging="0" w:left="0" w:right="0"/>
@@ -2232,7 +2052,6 @@
               <w:keepNext w:val="false"/>
               <w:keepLines w:val="false"/>
               <w:widowControl w:val="false"/>
-              <w:pBdr/>
               <w:shd w:val="clear" w:fill="auto"/>
               <w:spacing w:lineRule="auto" w:line="240" w:before="0" w:after="0"/>
               <w:ind w:hanging="0" w:left="0" w:right="0"/>
@@ -2254,7 +2073,6 @@
               <w:keepNext w:val="false"/>
               <w:keepLines w:val="false"/>
               <w:widowControl w:val="false"/>
-              <w:pBdr/>
               <w:shd w:val="clear" w:fill="auto"/>
               <w:spacing w:lineRule="auto" w:line="240" w:before="0" w:after="0"/>
               <w:ind w:hanging="0" w:left="0" w:right="0"/>
@@ -2276,7 +2094,6 @@
               <w:keepNext w:val="false"/>
               <w:keepLines w:val="false"/>
               <w:widowControl w:val="false"/>
-              <w:pBdr/>
               <w:shd w:val="clear" w:fill="auto"/>
               <w:spacing w:lineRule="auto" w:line="240" w:before="0" w:after="0"/>
               <w:ind w:hanging="0" w:left="0" w:right="0"/>
@@ -2298,7 +2115,6 @@
               <w:keepNext w:val="false"/>
               <w:keepLines w:val="false"/>
               <w:widowControl w:val="false"/>
-              <w:pBdr/>
               <w:shd w:val="clear" w:fill="auto"/>
               <w:spacing w:lineRule="auto" w:line="240" w:before="0" w:after="0"/>
               <w:ind w:hanging="0" w:left="0" w:right="0"/>
@@ -2338,11 +2154,7 @@
       </w:pPr>
       <w:r>
         <w:rPr/>
-        <w:t>5</w:t>
-      </w:r>
-      <w:r>
-        <w:rPr/>
-        <w:t>) Also you can delete any use, below are the rules -</w:t>
+        <w:t>5) Also you can delete any use, below are the rules -</w:t>
       </w:r>
     </w:p>
     <w:p>
@@ -2499,7 +2311,6 @@
               <w:keepNext w:val="false"/>
               <w:keepLines w:val="false"/>
               <w:widowControl w:val="false"/>
-              <w:pBdr/>
               <w:shd w:val="clear" w:fill="auto"/>
               <w:spacing w:lineRule="auto" w:line="240" w:before="0" w:after="0"/>
               <w:ind w:hanging="0" w:left="0" w:right="0"/>
@@ -2521,7 +2332,6 @@
               <w:keepNext w:val="false"/>
               <w:keepLines w:val="false"/>
               <w:widowControl w:val="false"/>
-              <w:pBdr/>
               <w:shd w:val="clear" w:fill="auto"/>
               <w:spacing w:lineRule="auto" w:line="240" w:before="0" w:after="0"/>
               <w:ind w:hanging="0" w:left="0" w:right="0"/>
@@ -2549,7 +2359,6 @@
               <w:keepNext w:val="false"/>
               <w:keepLines w:val="false"/>
               <w:widowControl w:val="false"/>
-              <w:pBdr/>
               <w:shd w:val="clear" w:fill="auto"/>
               <w:spacing w:lineRule="auto" w:line="240" w:before="0" w:after="0"/>
               <w:ind w:hanging="0" w:left="0" w:right="0"/>
@@ -2577,7 +2386,6 @@
               <w:keepNext w:val="false"/>
               <w:keepLines w:val="false"/>
               <w:widowControl w:val="false"/>
-              <w:pBdr/>
               <w:shd w:val="clear" w:fill="auto"/>
               <w:spacing w:lineRule="auto" w:line="240" w:before="0" w:after="0"/>
               <w:ind w:hanging="0" w:left="0" w:right="0"/>
@@ -2605,7 +2413,6 @@
               <w:keepNext w:val="false"/>
               <w:keepLines w:val="false"/>
               <w:widowControl w:val="false"/>
-              <w:pBdr/>
               <w:shd w:val="clear" w:fill="auto"/>
               <w:spacing w:lineRule="auto" w:line="240" w:before="0" w:after="0"/>
               <w:ind w:hanging="0" w:left="0" w:right="0"/>
@@ -2687,7 +2494,6 @@
               <w:keepNext w:val="false"/>
               <w:keepLines w:val="false"/>
               <w:widowControl w:val="false"/>
-              <w:pBdr/>
               <w:shd w:val="clear" w:fill="auto"/>
               <w:spacing w:lineRule="auto" w:line="240" w:before="0" w:after="0"/>
               <w:ind w:hanging="0" w:left="0" w:right="0"/>
@@ -2709,7 +2515,6 @@
               <w:keepNext w:val="false"/>
               <w:keepLines w:val="false"/>
               <w:widowControl w:val="false"/>
-              <w:pBdr/>
               <w:shd w:val="clear" w:fill="auto"/>
               <w:spacing w:lineRule="auto" w:line="240" w:before="0" w:after="0"/>
               <w:ind w:hanging="0" w:left="0" w:right="0"/>
@@ -2737,7 +2542,6 @@
               <w:keepNext w:val="false"/>
               <w:keepLines w:val="false"/>
               <w:widowControl w:val="false"/>
-              <w:pBdr/>
               <w:shd w:val="clear" w:fill="auto"/>
               <w:spacing w:lineRule="auto" w:line="240" w:before="0" w:after="0"/>
               <w:ind w:hanging="0" w:left="0" w:right="0"/>
@@ -2765,7 +2569,6 @@
               <w:keepNext w:val="false"/>
               <w:keepLines w:val="false"/>
               <w:widowControl w:val="false"/>
-              <w:pBdr/>
               <w:shd w:val="clear" w:fill="auto"/>
               <w:spacing w:lineRule="auto" w:line="240" w:before="0" w:after="0"/>
               <w:ind w:hanging="0" w:left="0" w:right="0"/>
@@ -2793,7 +2596,6 @@
               <w:keepNext w:val="false"/>
               <w:keepLines w:val="false"/>
               <w:widowControl w:val="false"/>
-              <w:pBdr/>
               <w:shd w:val="clear" w:fill="auto"/>
               <w:spacing w:lineRule="auto" w:line="240" w:before="0" w:after="0"/>
               <w:ind w:hanging="0" w:left="0" w:right="0"/>
@@ -2821,7 +2623,6 @@
               <w:keepNext w:val="false"/>
               <w:keepLines w:val="false"/>
               <w:widowControl w:val="false"/>
-              <w:pBdr/>
               <w:shd w:val="clear" w:fill="auto"/>
               <w:spacing w:lineRule="auto" w:line="240" w:before="0" w:after="0"/>
               <w:ind w:hanging="0" w:left="0" w:right="0"/>
@@ -2849,7 +2650,6 @@
               <w:keepNext w:val="false"/>
               <w:keepLines w:val="false"/>
               <w:widowControl w:val="false"/>
-              <w:pBdr/>
               <w:shd w:val="clear" w:fill="auto"/>
               <w:spacing w:lineRule="auto" w:line="240" w:before="0" w:after="0"/>
               <w:ind w:hanging="0" w:left="0" w:right="0"/>
@@ -2877,7 +2677,6 @@
               <w:keepNext w:val="false"/>
               <w:keepLines w:val="false"/>
               <w:widowControl w:val="false"/>
-              <w:pBdr/>
               <w:shd w:val="clear" w:fill="auto"/>
               <w:spacing w:lineRule="auto" w:line="240" w:before="0" w:after="0"/>
               <w:ind w:hanging="0" w:left="0" w:right="0"/>
@@ -2905,7 +2704,6 @@
               <w:keepNext w:val="false"/>
               <w:keepLines w:val="false"/>
               <w:widowControl w:val="false"/>
-              <w:pBdr/>
               <w:shd w:val="clear" w:fill="auto"/>
               <w:spacing w:lineRule="auto" w:line="240" w:before="0" w:after="0"/>
               <w:ind w:hanging="0" w:left="0" w:right="0"/>
@@ -2933,7 +2731,6 @@
               <w:keepNext w:val="false"/>
               <w:keepLines w:val="false"/>
               <w:widowControl w:val="false"/>
-              <w:pBdr/>
               <w:shd w:val="clear" w:fill="auto"/>
               <w:spacing w:lineRule="auto" w:line="240" w:before="0" w:after="0"/>
               <w:ind w:hanging="0" w:left="0" w:right="0"/>
@@ -2961,7 +2758,6 @@
               <w:keepNext w:val="false"/>
               <w:keepLines w:val="false"/>
               <w:widowControl w:val="false"/>
-              <w:pBdr/>
               <w:shd w:val="clear" w:fill="auto"/>
               <w:spacing w:lineRule="auto" w:line="240" w:before="0" w:after="0"/>
               <w:ind w:hanging="0" w:left="0" w:right="0"/>
@@ -2989,7 +2785,6 @@
               <w:keepNext w:val="false"/>
               <w:keepLines w:val="false"/>
               <w:widowControl w:val="false"/>
-              <w:pBdr/>
               <w:shd w:val="clear" w:fill="auto"/>
               <w:spacing w:lineRule="auto" w:line="240" w:before="0" w:after="0"/>
               <w:ind w:hanging="0" w:left="0" w:right="0"/>
@@ -3017,7 +2812,6 @@
               <w:keepNext w:val="false"/>
               <w:keepLines w:val="false"/>
               <w:widowControl w:val="false"/>
-              <w:pBdr/>
               <w:shd w:val="clear" w:fill="auto"/>
               <w:spacing w:lineRule="auto" w:line="240" w:before="0" w:after="0"/>
               <w:ind w:hanging="0" w:left="0" w:right="0"/>
@@ -3045,7 +2839,6 @@
               <w:keepNext w:val="false"/>
               <w:keepLines w:val="false"/>
               <w:widowControl w:val="false"/>
-              <w:pBdr/>
               <w:shd w:val="clear" w:fill="auto"/>
               <w:spacing w:lineRule="auto" w:line="240" w:before="0" w:after="0"/>
               <w:ind w:hanging="0" w:left="0" w:right="0"/>
@@ -3322,7 +3115,7 @@
           <wp:inline distT="0" distB="0" distL="0" distR="0">
             <wp:extent cx="1943100" cy="828675"/>
             <wp:effectExtent l="0" t="0" r="0" b="0"/>
-            <wp:docPr id="2" name="image3.png" descr=""/>
+            <wp:docPr id="1" name="image3.png" descr=""/>
             <wp:cNvGraphicFramePr>
               <a:graphicFrameLocks xmlns:a="http://schemas.openxmlformats.org/drawingml/2006/main" noChangeAspect="1"/>
             </wp:cNvGraphicFramePr>
@@ -3330,13 +3123,13 @@
               <a:graphicData uri="http://schemas.openxmlformats.org/drawingml/2006/picture">
                 <pic:pic xmlns:pic="http://schemas.openxmlformats.org/drawingml/2006/picture">
                   <pic:nvPicPr>
-                    <pic:cNvPr id="2" name="image3.png" descr=""/>
+                    <pic:cNvPr id="1" name="image3.png" descr=""/>
                     <pic:cNvPicPr>
                       <a:picLocks noChangeAspect="1" noChangeArrowheads="1"/>
                     </pic:cNvPicPr>
                   </pic:nvPicPr>
                   <pic:blipFill>
-                    <a:blip r:embed="rId4"/>
+                    <a:blip r:embed="rId3"/>
                     <a:srcRect l="0" t="0" r="6027" b="0"/>
                     <a:stretch>
                       <a:fillRect/>
@@ -3436,9 +3229,6 @@
       <w:r>
         <w:rPr/>
         <w:t xml:space="preserve">Always “#” will be added as a prefix for category name </w:t>
-      </w:r>
-      <w:r>
-        <w:rPr/>
         <w:br/>
       </w:r>
     </w:p>
@@ -3688,7 +3478,6 @@
               <w:keepNext w:val="false"/>
               <w:keepLines w:val="false"/>
               <w:widowControl w:val="false"/>
-              <w:pBdr/>
               <w:shd w:val="clear" w:fill="auto"/>
               <w:spacing w:lineRule="auto" w:line="240" w:before="0" w:after="0"/>
               <w:ind w:hanging="0" w:left="0" w:right="0"/>
@@ -3706,7 +3495,6 @@
               <w:keepNext w:val="false"/>
               <w:keepLines w:val="false"/>
               <w:widowControl w:val="false"/>
-              <w:pBdr/>
               <w:shd w:val="clear" w:fill="auto"/>
               <w:spacing w:lineRule="auto" w:line="240" w:before="0" w:after="0"/>
               <w:ind w:hanging="0" w:left="0" w:right="0"/>
@@ -3728,7 +3516,6 @@
               <w:keepNext w:val="false"/>
               <w:keepLines w:val="false"/>
               <w:widowControl w:val="false"/>
-              <w:pBdr/>
               <w:shd w:val="clear" w:fill="auto"/>
               <w:spacing w:lineRule="auto" w:line="240" w:before="0" w:after="0"/>
               <w:ind w:hanging="0" w:left="0" w:right="0"/>
@@ -3750,7 +3537,6 @@
               <w:keepNext w:val="false"/>
               <w:keepLines w:val="false"/>
               <w:widowControl w:val="false"/>
-              <w:pBdr/>
               <w:shd w:val="clear" w:fill="auto"/>
               <w:spacing w:lineRule="auto" w:line="240" w:before="0" w:after="0"/>
               <w:ind w:hanging="0" w:left="0" w:right="0"/>
@@ -3772,7 +3558,6 @@
               <w:keepNext w:val="false"/>
               <w:keepLines w:val="false"/>
               <w:widowControl w:val="false"/>
-              <w:pBdr/>
               <w:shd w:val="clear" w:fill="auto"/>
               <w:spacing w:lineRule="auto" w:line="240" w:before="0" w:after="0"/>
               <w:ind w:hanging="0" w:left="0" w:right="0"/>
@@ -3794,7 +3579,6 @@
               <w:keepNext w:val="false"/>
               <w:keepLines w:val="false"/>
               <w:widowControl w:val="false"/>
-              <w:pBdr/>
               <w:shd w:val="clear" w:fill="auto"/>
               <w:spacing w:lineRule="auto" w:line="240" w:before="0" w:after="0"/>
               <w:ind w:hanging="0" w:left="0" w:right="0"/>
@@ -3816,7 +3600,6 @@
               <w:keepNext w:val="false"/>
               <w:keepLines w:val="false"/>
               <w:widowControl w:val="false"/>
-              <w:pBdr/>
               <w:shd w:val="clear" w:fill="auto"/>
               <w:spacing w:lineRule="auto" w:line="240" w:before="0" w:after="0"/>
               <w:ind w:hanging="0" w:left="0" w:right="0"/>
@@ -3838,7 +3621,6 @@
               <w:keepNext w:val="false"/>
               <w:keepLines w:val="false"/>
               <w:widowControl w:val="false"/>
-              <w:pBdr/>
               <w:shd w:val="clear" w:fill="auto"/>
               <w:spacing w:lineRule="auto" w:line="240" w:before="0" w:after="0"/>
               <w:ind w:hanging="0" w:left="0" w:right="0"/>
@@ -3860,7 +3642,6 @@
               <w:keepNext w:val="false"/>
               <w:keepLines w:val="false"/>
               <w:widowControl w:val="false"/>
-              <w:pBdr/>
               <w:shd w:val="clear" w:fill="auto"/>
               <w:spacing w:lineRule="auto" w:line="240" w:before="0" w:after="0"/>
               <w:ind w:hanging="0" w:left="0" w:right="0"/>
@@ -3882,7 +3663,6 @@
               <w:keepNext w:val="false"/>
               <w:keepLines w:val="false"/>
               <w:widowControl w:val="false"/>
-              <w:pBdr/>
               <w:shd w:val="clear" w:fill="auto"/>
               <w:spacing w:lineRule="auto" w:line="240" w:before="0" w:after="0"/>
               <w:ind w:hanging="0" w:left="0" w:right="0"/>
@@ -3904,7 +3684,6 @@
               <w:keepNext w:val="false"/>
               <w:keepLines w:val="false"/>
               <w:widowControl w:val="false"/>
-              <w:pBdr/>
               <w:shd w:val="clear" w:fill="auto"/>
               <w:spacing w:lineRule="auto" w:line="240" w:before="0" w:after="0"/>
               <w:ind w:hanging="0" w:left="0" w:right="0"/>
@@ -3926,7 +3705,6 @@
               <w:keepNext w:val="false"/>
               <w:keepLines w:val="false"/>
               <w:widowControl w:val="false"/>
-              <w:pBdr/>
               <w:shd w:val="clear" w:fill="auto"/>
               <w:spacing w:lineRule="auto" w:line="240" w:before="0" w:after="0"/>
               <w:ind w:hanging="0" w:left="0" w:right="0"/>
@@ -3948,7 +3726,6 @@
               <w:keepNext w:val="false"/>
               <w:keepLines w:val="false"/>
               <w:widowControl w:val="false"/>
-              <w:pBdr/>
               <w:shd w:val="clear" w:fill="auto"/>
               <w:spacing w:lineRule="auto" w:line="240" w:before="0" w:after="0"/>
               <w:ind w:hanging="0" w:left="0" w:right="0"/>
@@ -3970,7 +3747,6 @@
               <w:keepNext w:val="false"/>
               <w:keepLines w:val="false"/>
               <w:widowControl w:val="false"/>
-              <w:pBdr/>
               <w:shd w:val="clear" w:fill="auto"/>
               <w:spacing w:lineRule="auto" w:line="240" w:before="0" w:after="0"/>
               <w:ind w:hanging="0" w:left="0" w:right="0"/>
@@ -3992,7 +3768,6 @@
               <w:keepNext w:val="false"/>
               <w:keepLines w:val="false"/>
               <w:widowControl w:val="false"/>
-              <w:pBdr/>
               <w:shd w:val="clear" w:fill="auto"/>
               <w:spacing w:lineRule="auto" w:line="240" w:before="0" w:after="0"/>
               <w:ind w:hanging="0" w:left="0" w:right="0"/>
@@ -4014,7 +3789,6 @@
               <w:keepNext w:val="false"/>
               <w:keepLines w:val="false"/>
               <w:widowControl w:val="false"/>
-              <w:pBdr/>
               <w:shd w:val="clear" w:fill="auto"/>
               <w:spacing w:lineRule="auto" w:line="240" w:before="0" w:after="0"/>
               <w:ind w:hanging="0" w:left="0" w:right="0"/>
@@ -4036,7 +3810,6 @@
               <w:keepNext w:val="false"/>
               <w:keepLines w:val="false"/>
               <w:widowControl w:val="false"/>
-              <w:pBdr/>
               <w:shd w:val="clear" w:fill="auto"/>
               <w:spacing w:lineRule="auto" w:line="240" w:before="0" w:after="0"/>
               <w:ind w:hanging="0" w:left="0" w:right="0"/>
@@ -4058,7 +3831,6 @@
               <w:keepNext w:val="false"/>
               <w:keepLines w:val="false"/>
               <w:widowControl w:val="false"/>
-              <w:pBdr/>
               <w:shd w:val="clear" w:fill="auto"/>
               <w:spacing w:lineRule="auto" w:line="240" w:before="0" w:after="0"/>
               <w:ind w:hanging="0" w:left="0" w:right="0"/>
@@ -4080,7 +3852,6 @@
               <w:keepNext w:val="false"/>
               <w:keepLines w:val="false"/>
               <w:widowControl w:val="false"/>
-              <w:pBdr/>
               <w:shd w:val="clear" w:fill="auto"/>
               <w:spacing w:lineRule="auto" w:line="240" w:before="0" w:after="0"/>
               <w:ind w:hanging="0" w:left="0" w:right="0"/>
@@ -4102,7 +3873,6 @@
               <w:keepNext w:val="false"/>
               <w:keepLines w:val="false"/>
               <w:widowControl w:val="false"/>
-              <w:pBdr/>
               <w:shd w:val="clear" w:fill="auto"/>
               <w:spacing w:lineRule="auto" w:line="240" w:before="0" w:after="0"/>
               <w:ind w:hanging="0" w:left="0" w:right="0"/>
@@ -4124,7 +3894,6 @@
               <w:keepNext w:val="false"/>
               <w:keepLines w:val="false"/>
               <w:widowControl w:val="false"/>
-              <w:pBdr/>
               <w:shd w:val="clear" w:fill="auto"/>
               <w:spacing w:lineRule="auto" w:line="240" w:before="0" w:after="0"/>
               <w:ind w:hanging="0" w:left="0" w:right="0"/>
@@ -4285,7 +4054,6 @@
               <w:keepNext w:val="false"/>
               <w:keepLines w:val="false"/>
               <w:widowControl w:val="false"/>
-              <w:pBdr/>
               <w:shd w:val="clear" w:fill="auto"/>
               <w:spacing w:lineRule="auto" w:line="240" w:before="0" w:after="0"/>
               <w:ind w:hanging="0" w:left="0" w:right="0"/>
@@ -4303,7 +4071,6 @@
               <w:keepNext w:val="false"/>
               <w:keepLines w:val="false"/>
               <w:widowControl w:val="false"/>
-              <w:pBdr/>
               <w:shd w:val="clear" w:fill="auto"/>
               <w:spacing w:lineRule="auto" w:line="240" w:before="0" w:after="0"/>
               <w:ind w:hanging="0" w:left="0" w:right="0"/>
@@ -4325,7 +4092,6 @@
               <w:keepNext w:val="false"/>
               <w:keepLines w:val="false"/>
               <w:widowControl w:val="false"/>
-              <w:pBdr/>
               <w:shd w:val="clear" w:fill="auto"/>
               <w:spacing w:lineRule="auto" w:line="240" w:before="0" w:after="0"/>
               <w:ind w:hanging="0" w:left="0" w:right="0"/>
@@ -4347,7 +4113,6 @@
               <w:keepNext w:val="false"/>
               <w:keepLines w:val="false"/>
               <w:widowControl w:val="false"/>
-              <w:pBdr/>
               <w:shd w:val="clear" w:fill="auto"/>
               <w:spacing w:lineRule="auto" w:line="240" w:before="0" w:after="0"/>
               <w:ind w:hanging="0" w:left="0" w:right="0"/>
@@ -4369,7 +4134,6 @@
               <w:keepNext w:val="false"/>
               <w:keepLines w:val="false"/>
               <w:widowControl w:val="false"/>
-              <w:pBdr/>
               <w:shd w:val="clear" w:fill="auto"/>
               <w:spacing w:lineRule="auto" w:line="240" w:before="0" w:after="0"/>
               <w:ind w:hanging="0" w:left="0" w:right="0"/>
@@ -4391,7 +4155,6 @@
               <w:keepNext w:val="false"/>
               <w:keepLines w:val="false"/>
               <w:widowControl w:val="false"/>
-              <w:pBdr/>
               <w:shd w:val="clear" w:fill="auto"/>
               <w:spacing w:lineRule="auto" w:line="240" w:before="0" w:after="0"/>
               <w:ind w:hanging="0" w:left="0" w:right="0"/>
@@ -4413,7 +4176,6 @@
               <w:keepNext w:val="false"/>
               <w:keepLines w:val="false"/>
               <w:widowControl w:val="false"/>
-              <w:pBdr/>
               <w:shd w:val="clear" w:fill="auto"/>
               <w:spacing w:lineRule="auto" w:line="240" w:before="0" w:after="0"/>
               <w:ind w:hanging="0" w:left="0" w:right="0"/>
@@ -4435,7 +4197,6 @@
               <w:keepNext w:val="false"/>
               <w:keepLines w:val="false"/>
               <w:widowControl w:val="false"/>
-              <w:pBdr/>
               <w:shd w:val="clear" w:fill="auto"/>
               <w:spacing w:lineRule="auto" w:line="240" w:before="0" w:after="0"/>
               <w:ind w:hanging="0" w:left="0" w:right="0"/>
@@ -4457,7 +4218,6 @@
               <w:keepNext w:val="false"/>
               <w:keepLines w:val="false"/>
               <w:widowControl w:val="false"/>
-              <w:pBdr/>
               <w:shd w:val="clear" w:fill="auto"/>
               <w:spacing w:lineRule="auto" w:line="240" w:before="0" w:after="0"/>
               <w:ind w:hanging="0" w:left="0" w:right="0"/>
@@ -4479,24 +4239,22 @@
               <w:keepNext w:val="false"/>
               <w:keepLines w:val="false"/>
               <w:widowControl w:val="false"/>
-              <w:pBdr/>
-              <w:shd w:val="clear" w:fill="auto"/>
-              <w:spacing w:lineRule="auto" w:line="240" w:before="0" w:after="0"/>
-              <w:ind w:hanging="0" w:left="0" w:right="0"/>
-              <w:jc w:val="left"/>
-              <w:rPr/>
-            </w:pPr>
-            <w:r>
-              <w:rPr/>
-            </w:r>
-          </w:p>
-          <w:p>
-            <w:pPr>
-              <w:pStyle w:val="normal1"/>
-              <w:keepNext w:val="false"/>
-              <w:keepLines w:val="false"/>
-              <w:widowControl w:val="false"/>
-              <w:pBdr/>
+              <w:shd w:val="clear" w:fill="auto"/>
+              <w:spacing w:lineRule="auto" w:line="240" w:before="0" w:after="0"/>
+              <w:ind w:hanging="0" w:left="0" w:right="0"/>
+              <w:jc w:val="left"/>
+              <w:rPr/>
+            </w:pPr>
+            <w:r>
+              <w:rPr/>
+            </w:r>
+          </w:p>
+          <w:p>
+            <w:pPr>
+              <w:pStyle w:val="normal1"/>
+              <w:keepNext w:val="false"/>
+              <w:keepLines w:val="false"/>
+              <w:widowControl w:val="false"/>
               <w:shd w:val="clear" w:fill="auto"/>
               <w:spacing w:lineRule="auto" w:line="240" w:before="0" w:after="0"/>
               <w:ind w:hanging="0" w:left="0" w:right="0"/>
@@ -4585,7 +4343,6 @@
               <w:keepNext w:val="false"/>
               <w:keepLines w:val="false"/>
               <w:widowControl w:val="false"/>
-              <w:pBdr/>
               <w:shd w:val="clear" w:fill="auto"/>
               <w:spacing w:lineRule="auto" w:line="240" w:before="0" w:after="0"/>
               <w:ind w:hanging="0" w:left="0" w:right="0"/>
@@ -4603,7 +4360,6 @@
               <w:keepNext w:val="false"/>
               <w:keepLines w:val="false"/>
               <w:widowControl w:val="false"/>
-              <w:pBdr/>
               <w:shd w:val="clear" w:fill="auto"/>
               <w:spacing w:lineRule="auto" w:line="240" w:before="0" w:after="0"/>
               <w:ind w:hanging="0" w:left="0" w:right="0"/>
@@ -4625,7 +4381,6 @@
               <w:keepNext w:val="false"/>
               <w:keepLines w:val="false"/>
               <w:widowControl w:val="false"/>
-              <w:pBdr/>
               <w:shd w:val="clear" w:fill="auto"/>
               <w:spacing w:lineRule="auto" w:line="240" w:before="0" w:after="0"/>
               <w:ind w:hanging="0" w:left="0" w:right="0"/>
@@ -4647,7 +4402,6 @@
               <w:keepNext w:val="false"/>
               <w:keepLines w:val="false"/>
               <w:widowControl w:val="false"/>
-              <w:pBdr/>
               <w:shd w:val="clear" w:fill="auto"/>
               <w:spacing w:lineRule="auto" w:line="240" w:before="0" w:after="0"/>
               <w:ind w:hanging="0" w:left="0" w:right="0"/>
@@ -4669,7 +4423,6 @@
               <w:keepNext w:val="false"/>
               <w:keepLines w:val="false"/>
               <w:widowControl w:val="false"/>
-              <w:pBdr/>
               <w:shd w:val="clear" w:fill="auto"/>
               <w:spacing w:lineRule="auto" w:line="240" w:before="0" w:after="0"/>
               <w:ind w:hanging="0" w:left="0" w:right="0"/>
@@ -4691,7 +4444,6 @@
               <w:keepNext w:val="false"/>
               <w:keepLines w:val="false"/>
               <w:widowControl w:val="false"/>
-              <w:pBdr/>
               <w:shd w:val="clear" w:fill="auto"/>
               <w:spacing w:lineRule="auto" w:line="240" w:before="0" w:after="0"/>
               <w:ind w:hanging="0" w:left="0" w:right="0"/>
@@ -4713,7 +4465,6 @@
               <w:keepNext w:val="false"/>
               <w:keepLines w:val="false"/>
               <w:widowControl w:val="false"/>
-              <w:pBdr/>
               <w:shd w:val="clear" w:fill="auto"/>
               <w:spacing w:lineRule="auto" w:line="240" w:before="0" w:after="0"/>
               <w:ind w:hanging="0" w:left="0" w:right="0"/>
@@ -4735,7 +4486,6 @@
               <w:keepNext w:val="false"/>
               <w:keepLines w:val="false"/>
               <w:widowControl w:val="false"/>
-              <w:pBdr/>
               <w:shd w:val="clear" w:fill="auto"/>
               <w:spacing w:lineRule="auto" w:line="240" w:before="0" w:after="0"/>
               <w:ind w:hanging="0" w:left="0" w:right="0"/>
@@ -4757,7 +4507,6 @@
               <w:keepNext w:val="false"/>
               <w:keepLines w:val="false"/>
               <w:widowControl w:val="false"/>
-              <w:pBdr/>
               <w:shd w:val="clear" w:fill="auto"/>
               <w:spacing w:lineRule="auto" w:line="240" w:before="0" w:after="0"/>
               <w:ind w:hanging="0" w:left="0" w:right="0"/>
@@ -4779,7 +4528,6 @@
               <w:keepNext w:val="false"/>
               <w:keepLines w:val="false"/>
               <w:widowControl w:val="false"/>
-              <w:pBdr/>
               <w:shd w:val="clear" w:fill="auto"/>
               <w:spacing w:lineRule="auto" w:line="240" w:before="0" w:after="0"/>
               <w:ind w:hanging="0" w:left="0" w:right="0"/>
@@ -4801,7 +4549,6 @@
               <w:keepNext w:val="false"/>
               <w:keepLines w:val="false"/>
               <w:widowControl w:val="false"/>
-              <w:pBdr/>
               <w:shd w:val="clear" w:fill="auto"/>
               <w:spacing w:lineRule="auto" w:line="240" w:before="0" w:after="0"/>
               <w:ind w:hanging="0" w:left="0" w:right="0"/>
@@ -4823,7 +4570,6 @@
               <w:keepNext w:val="false"/>
               <w:keepLines w:val="false"/>
               <w:widowControl w:val="false"/>
-              <w:pBdr/>
               <w:shd w:val="clear" w:fill="auto"/>
               <w:spacing w:lineRule="auto" w:line="240" w:before="0" w:after="0"/>
               <w:ind w:hanging="0" w:left="0" w:right="0"/>
@@ -4845,7 +4591,6 @@
               <w:keepNext w:val="false"/>
               <w:keepLines w:val="false"/>
               <w:widowControl w:val="false"/>
-              <w:pBdr/>
               <w:shd w:val="clear" w:fill="auto"/>
               <w:spacing w:lineRule="auto" w:line="240" w:before="0" w:after="0"/>
               <w:ind w:hanging="0" w:left="0" w:right="0"/>
@@ -4867,7 +4612,6 @@
               <w:keepNext w:val="false"/>
               <w:keepLines w:val="false"/>
               <w:widowControl w:val="false"/>
-              <w:pBdr/>
               <w:shd w:val="clear" w:fill="auto"/>
               <w:spacing w:lineRule="auto" w:line="240" w:before="0" w:after="0"/>
               <w:ind w:hanging="0" w:left="0" w:right="0"/>
@@ -4889,7 +4633,6 @@
               <w:keepNext w:val="false"/>
               <w:keepLines w:val="false"/>
               <w:widowControl w:val="false"/>
-              <w:pBdr/>
               <w:shd w:val="clear" w:fill="auto"/>
               <w:spacing w:lineRule="auto" w:line="240" w:before="0" w:after="0"/>
               <w:ind w:hanging="0" w:left="0" w:right="0"/>
@@ -4911,7 +4654,6 @@
               <w:keepNext w:val="false"/>
               <w:keepLines w:val="false"/>
               <w:widowControl w:val="false"/>
-              <w:pBdr/>
               <w:shd w:val="clear" w:fill="auto"/>
               <w:spacing w:lineRule="auto" w:line="240" w:before="0" w:after="0"/>
               <w:ind w:hanging="0" w:left="0" w:right="0"/>
@@ -4933,7 +4675,6 @@
               <w:keepNext w:val="false"/>
               <w:keepLines w:val="false"/>
               <w:widowControl w:val="false"/>
-              <w:pBdr/>
               <w:shd w:val="clear" w:fill="auto"/>
               <w:spacing w:lineRule="auto" w:line="240" w:before="0" w:after="0"/>
               <w:ind w:hanging="0" w:left="0" w:right="0"/>
@@ -4955,7 +4696,6 @@
               <w:keepNext w:val="false"/>
               <w:keepLines w:val="false"/>
               <w:widowControl w:val="false"/>
-              <w:pBdr/>
               <w:shd w:val="clear" w:fill="auto"/>
               <w:spacing w:lineRule="auto" w:line="240" w:before="0" w:after="0"/>
               <w:ind w:hanging="0" w:left="0" w:right="0"/>
@@ -4977,7 +4717,6 @@
               <w:keepNext w:val="false"/>
               <w:keepLines w:val="false"/>
               <w:widowControl w:val="false"/>
-              <w:pBdr/>
               <w:shd w:val="clear" w:fill="auto"/>
               <w:spacing w:lineRule="auto" w:line="240" w:before="0" w:after="0"/>
               <w:ind w:hanging="0" w:left="0" w:right="0"/>
@@ -4999,7 +4738,6 @@
               <w:keepNext w:val="false"/>
               <w:keepLines w:val="false"/>
               <w:widowControl w:val="false"/>
-              <w:pBdr/>
               <w:shd w:val="clear" w:fill="auto"/>
               <w:spacing w:lineRule="auto" w:line="240" w:before="0" w:after="0"/>
               <w:ind w:hanging="0" w:left="0" w:right="0"/>
@@ -5021,7 +4759,6 @@
               <w:keepNext w:val="false"/>
               <w:keepLines w:val="false"/>
               <w:widowControl w:val="false"/>
-              <w:pBdr/>
               <w:shd w:val="clear" w:fill="auto"/>
               <w:spacing w:lineRule="auto" w:line="240" w:before="0" w:after="0"/>
               <w:ind w:hanging="0" w:left="0" w:right="0"/>
@@ -5251,7 +4988,6 @@
               <w:keepNext w:val="false"/>
               <w:keepLines w:val="false"/>
               <w:widowControl w:val="false"/>
-              <w:pBdr/>
               <w:shd w:val="clear" w:fill="auto"/>
               <w:spacing w:lineRule="auto" w:line="240" w:before="0" w:after="0"/>
               <w:ind w:hanging="0" w:left="0" w:right="0"/>
@@ -5269,7 +5005,6 @@
               <w:keepNext w:val="false"/>
               <w:keepLines w:val="false"/>
               <w:widowControl w:val="false"/>
-              <w:pBdr/>
               <w:shd w:val="clear" w:fill="auto"/>
               <w:spacing w:lineRule="auto" w:line="240" w:before="0" w:after="0"/>
               <w:ind w:hanging="0" w:left="0" w:right="0"/>
@@ -5291,7 +5026,6 @@
               <w:keepNext w:val="false"/>
               <w:keepLines w:val="false"/>
               <w:widowControl w:val="false"/>
-              <w:pBdr/>
               <w:shd w:val="clear" w:fill="auto"/>
               <w:spacing w:lineRule="auto" w:line="240" w:before="0" w:after="0"/>
               <w:ind w:hanging="0" w:left="0" w:right="0"/>
@@ -5313,7 +5047,6 @@
               <w:keepNext w:val="false"/>
               <w:keepLines w:val="false"/>
               <w:widowControl w:val="false"/>
-              <w:pBdr/>
               <w:shd w:val="clear" w:fill="auto"/>
               <w:spacing w:lineRule="auto" w:line="240" w:before="0" w:after="0"/>
               <w:ind w:hanging="0" w:left="0" w:right="0"/>
@@ -5388,7 +5121,6 @@
               <w:keepNext w:val="false"/>
               <w:keepLines w:val="false"/>
               <w:widowControl w:val="false"/>
-              <w:pBdr/>
               <w:shd w:val="clear" w:fill="auto"/>
               <w:spacing w:lineRule="auto" w:line="240" w:before="0" w:after="0"/>
               <w:ind w:hanging="0" w:left="0" w:right="0"/>
@@ -5406,7 +5138,6 @@
               <w:keepNext w:val="false"/>
               <w:keepLines w:val="false"/>
               <w:widowControl w:val="false"/>
-              <w:pBdr/>
               <w:shd w:val="clear" w:fill="auto"/>
               <w:spacing w:lineRule="auto" w:line="240" w:before="0" w:after="0"/>
               <w:ind w:hanging="0" w:left="0" w:right="0"/>
@@ -5428,7 +5159,6 @@
               <w:keepNext w:val="false"/>
               <w:keepLines w:val="false"/>
               <w:widowControl w:val="false"/>
-              <w:pBdr/>
               <w:shd w:val="clear" w:fill="auto"/>
               <w:spacing w:lineRule="auto" w:line="240" w:before="0" w:after="0"/>
               <w:ind w:hanging="0" w:left="0" w:right="0"/>
@@ -5450,7 +5180,6 @@
               <w:keepNext w:val="false"/>
               <w:keepLines w:val="false"/>
               <w:widowControl w:val="false"/>
-              <w:pBdr/>
               <w:shd w:val="clear" w:fill="auto"/>
               <w:spacing w:lineRule="auto" w:line="240" w:before="0" w:after="0"/>
               <w:ind w:hanging="0" w:left="0" w:right="0"/>
@@ -5472,7 +5201,6 @@
               <w:keepNext w:val="false"/>
               <w:keepLines w:val="false"/>
               <w:widowControl w:val="false"/>
-              <w:pBdr/>
               <w:shd w:val="clear" w:fill="auto"/>
               <w:spacing w:lineRule="auto" w:line="240" w:before="0" w:after="0"/>
               <w:ind w:hanging="0" w:left="0" w:right="0"/>
@@ -5494,7 +5222,6 @@
               <w:keepNext w:val="false"/>
               <w:keepLines w:val="false"/>
               <w:widowControl w:val="false"/>
-              <w:pBdr/>
               <w:shd w:val="clear" w:fill="auto"/>
               <w:spacing w:lineRule="auto" w:line="240" w:before="0" w:after="0"/>
               <w:ind w:hanging="0" w:left="0" w:right="0"/>
@@ -5516,7 +5243,6 @@
               <w:keepNext w:val="false"/>
               <w:keepLines w:val="false"/>
               <w:widowControl w:val="false"/>
-              <w:pBdr/>
               <w:shd w:val="clear" w:fill="auto"/>
               <w:spacing w:lineRule="auto" w:line="240" w:before="0" w:after="0"/>
               <w:ind w:hanging="0" w:left="0" w:right="0"/>
@@ -5538,7 +5264,6 @@
               <w:keepNext w:val="false"/>
               <w:keepLines w:val="false"/>
               <w:widowControl w:val="false"/>
-              <w:pBdr/>
               <w:shd w:val="clear" w:fill="auto"/>
               <w:spacing w:lineRule="auto" w:line="240" w:before="0" w:after="0"/>
               <w:ind w:hanging="0" w:left="0" w:right="0"/>
@@ -5560,7 +5285,6 @@
               <w:keepNext w:val="false"/>
               <w:keepLines w:val="false"/>
               <w:widowControl w:val="false"/>
-              <w:pBdr/>
               <w:shd w:val="clear" w:fill="auto"/>
               <w:spacing w:lineRule="auto" w:line="240" w:before="0" w:after="0"/>
               <w:ind w:hanging="0" w:left="0" w:right="0"/>
@@ -5582,7 +5306,6 @@
               <w:keepNext w:val="false"/>
               <w:keepLines w:val="false"/>
               <w:widowControl w:val="false"/>
-              <w:pBdr/>
               <w:shd w:val="clear" w:fill="auto"/>
               <w:spacing w:lineRule="auto" w:line="240" w:before="0" w:after="0"/>
               <w:ind w:hanging="0" w:left="0" w:right="0"/>
@@ -5604,7 +5327,6 @@
               <w:keepNext w:val="false"/>
               <w:keepLines w:val="false"/>
               <w:widowControl w:val="false"/>
-              <w:pBdr/>
               <w:shd w:val="clear" w:fill="auto"/>
               <w:spacing w:lineRule="auto" w:line="240" w:before="0" w:after="0"/>
               <w:ind w:hanging="0" w:left="0" w:right="0"/>
@@ -5626,7 +5348,6 @@
               <w:keepNext w:val="false"/>
               <w:keepLines w:val="false"/>
               <w:widowControl w:val="false"/>
-              <w:pBdr/>
               <w:shd w:val="clear" w:fill="auto"/>
               <w:spacing w:lineRule="auto" w:line="240" w:before="0" w:after="0"/>
               <w:ind w:hanging="0" w:left="0" w:right="0"/>
@@ -5648,7 +5369,6 @@
               <w:keepNext w:val="false"/>
               <w:keepLines w:val="false"/>
               <w:widowControl w:val="false"/>
-              <w:pBdr/>
               <w:shd w:val="clear" w:fill="auto"/>
               <w:spacing w:lineRule="auto" w:line="240" w:before="0" w:after="0"/>
               <w:ind w:hanging="0" w:left="0" w:right="0"/>
@@ -5670,7 +5390,6 @@
               <w:keepNext w:val="false"/>
               <w:keepLines w:val="false"/>
               <w:widowControl w:val="false"/>
-              <w:pBdr/>
               <w:shd w:val="clear" w:fill="auto"/>
               <w:spacing w:lineRule="auto" w:line="240" w:before="0" w:after="0"/>
               <w:ind w:hanging="0" w:left="0" w:right="0"/>
@@ -5692,7 +5411,6 @@
               <w:keepNext w:val="false"/>
               <w:keepLines w:val="false"/>
               <w:widowControl w:val="false"/>
-              <w:pBdr/>
               <w:shd w:val="clear" w:fill="auto"/>
               <w:spacing w:lineRule="auto" w:line="240" w:before="0" w:after="0"/>
               <w:ind w:hanging="0" w:left="0" w:right="0"/>
@@ -5714,7 +5432,6 @@
               <w:keepNext w:val="false"/>
               <w:keepLines w:val="false"/>
               <w:widowControl w:val="false"/>
-              <w:pBdr/>
               <w:shd w:val="clear" w:fill="auto"/>
               <w:spacing w:lineRule="auto" w:line="240" w:before="0" w:after="0"/>
               <w:ind w:hanging="0" w:left="0" w:right="0"/>
@@ -5736,7 +5453,6 @@
               <w:keepNext w:val="false"/>
               <w:keepLines w:val="false"/>
               <w:widowControl w:val="false"/>
-              <w:pBdr/>
               <w:shd w:val="clear" w:fill="auto"/>
               <w:spacing w:lineRule="auto" w:line="240" w:before="0" w:after="0"/>
               <w:ind w:hanging="0" w:left="0" w:right="0"/>
@@ -5758,7 +5474,6 @@
               <w:keepNext w:val="false"/>
               <w:keepLines w:val="false"/>
               <w:widowControl w:val="false"/>
-              <w:pBdr/>
               <w:shd w:val="clear" w:fill="auto"/>
               <w:spacing w:lineRule="auto" w:line="240" w:before="0" w:after="0"/>
               <w:ind w:hanging="0" w:left="0" w:right="0"/>
@@ -5780,7 +5495,6 @@
               <w:keepNext w:val="false"/>
               <w:keepLines w:val="false"/>
               <w:widowControl w:val="false"/>
-              <w:pBdr/>
               <w:shd w:val="clear" w:fill="auto"/>
               <w:spacing w:lineRule="auto" w:line="240" w:before="0" w:after="0"/>
               <w:ind w:hanging="0" w:left="0" w:right="0"/>
@@ -5802,7 +5516,6 @@
               <w:keepNext w:val="false"/>
               <w:keepLines w:val="false"/>
               <w:widowControl w:val="false"/>
-              <w:pBdr/>
               <w:shd w:val="clear" w:fill="auto"/>
               <w:spacing w:lineRule="auto" w:line="240" w:before="0" w:after="0"/>
               <w:ind w:hanging="0" w:left="0" w:right="0"/>
@@ -5824,7 +5537,6 @@
               <w:keepNext w:val="false"/>
               <w:keepLines w:val="false"/>
               <w:widowControl w:val="false"/>
-              <w:pBdr/>
               <w:shd w:val="clear" w:fill="auto"/>
               <w:spacing w:lineRule="auto" w:line="240" w:before="0" w:after="0"/>
               <w:ind w:hanging="0" w:left="0" w:right="0"/>
@@ -6124,7 +5836,6 @@
               <w:keepNext w:val="false"/>
               <w:keepLines w:val="false"/>
               <w:widowControl w:val="false"/>
-              <w:pBdr/>
               <w:shd w:val="clear" w:fill="auto"/>
               <w:spacing w:lineRule="auto" w:line="240" w:before="0" w:after="0"/>
               <w:ind w:hanging="0" w:left="0" w:right="0"/>
@@ -6142,7 +5853,6 @@
               <w:keepNext w:val="false"/>
               <w:keepLines w:val="false"/>
               <w:widowControl w:val="false"/>
-              <w:pBdr/>
               <w:shd w:val="clear" w:fill="auto"/>
               <w:spacing w:lineRule="auto" w:line="240" w:before="0" w:after="0"/>
               <w:ind w:hanging="0" w:left="0" w:right="0"/>
@@ -6164,7 +5874,6 @@
               <w:keepNext w:val="false"/>
               <w:keepLines w:val="false"/>
               <w:widowControl w:val="false"/>
-              <w:pBdr/>
               <w:shd w:val="clear" w:fill="auto"/>
               <w:spacing w:lineRule="auto" w:line="240" w:before="0" w:after="0"/>
               <w:ind w:hanging="0" w:left="0" w:right="0"/>
@@ -6186,7 +5895,6 @@
               <w:keepNext w:val="false"/>
               <w:keepLines w:val="false"/>
               <w:widowControl w:val="false"/>
-              <w:pBdr/>
               <w:shd w:val="clear" w:fill="auto"/>
               <w:spacing w:lineRule="auto" w:line="240" w:before="0" w:after="0"/>
               <w:ind w:hanging="0" w:left="0" w:right="0"/>
@@ -6276,7 +5984,6 @@
               <w:keepNext w:val="false"/>
               <w:keepLines w:val="false"/>
               <w:widowControl w:val="false"/>
-              <w:pBdr/>
               <w:shd w:val="clear" w:fill="auto"/>
               <w:spacing w:lineRule="auto" w:line="240" w:before="0" w:after="0"/>
               <w:ind w:hanging="0" w:left="0" w:right="0"/>
@@ -6298,7 +6005,6 @@
               <w:keepNext w:val="false"/>
               <w:keepLines w:val="false"/>
               <w:widowControl w:val="false"/>
-              <w:pBdr/>
               <w:shd w:val="clear" w:fill="auto"/>
               <w:spacing w:lineRule="auto" w:line="240" w:before="0" w:after="0"/>
               <w:ind w:hanging="0" w:left="0" w:right="0"/>
@@ -6326,7 +6032,6 @@
               <w:keepNext w:val="false"/>
               <w:keepLines w:val="false"/>
               <w:widowControl w:val="false"/>
-              <w:pBdr/>
               <w:shd w:val="clear" w:fill="auto"/>
               <w:spacing w:lineRule="auto" w:line="240" w:before="0" w:after="0"/>
               <w:ind w:hanging="0" w:left="0" w:right="0"/>
@@ -6354,7 +6059,6 @@
               <w:keepNext w:val="false"/>
               <w:keepLines w:val="false"/>
               <w:widowControl w:val="false"/>
-              <w:pBdr/>
               <w:shd w:val="clear" w:fill="auto"/>
               <w:spacing w:lineRule="auto" w:line="240" w:before="0" w:after="0"/>
               <w:ind w:hanging="0" w:left="0" w:right="0"/>
@@ -6382,7 +6086,6 @@
               <w:keepNext w:val="false"/>
               <w:keepLines w:val="false"/>
               <w:widowControl w:val="false"/>
-              <w:pBdr/>
               <w:shd w:val="clear" w:fill="auto"/>
               <w:spacing w:lineRule="auto" w:line="240" w:before="0" w:after="0"/>
               <w:ind w:hanging="0" w:left="0" w:right="0"/>
@@ -6410,7 +6113,6 @@
               <w:keepNext w:val="false"/>
               <w:keepLines w:val="false"/>
               <w:widowControl w:val="false"/>
-              <w:pBdr/>
               <w:shd w:val="clear" w:fill="auto"/>
               <w:spacing w:lineRule="auto" w:line="240" w:before="0" w:after="0"/>
               <w:ind w:hanging="0" w:left="0" w:right="0"/>
@@ -6438,7 +6140,6 @@
               <w:keepNext w:val="false"/>
               <w:keepLines w:val="false"/>
               <w:widowControl w:val="false"/>
-              <w:pBdr/>
               <w:shd w:val="clear" w:fill="auto"/>
               <w:spacing w:lineRule="auto" w:line="240" w:before="0" w:after="0"/>
               <w:ind w:hanging="0" w:left="0" w:right="0"/>
@@ -6466,7 +6167,6 @@
               <w:keepNext w:val="false"/>
               <w:keepLines w:val="false"/>
               <w:widowControl w:val="false"/>
-              <w:pBdr/>
               <w:shd w:val="clear" w:fill="auto"/>
               <w:spacing w:lineRule="auto" w:line="240" w:before="0" w:after="0"/>
               <w:ind w:hanging="0" w:left="0" w:right="0"/>
@@ -6494,7 +6194,6 @@
               <w:keepNext w:val="false"/>
               <w:keepLines w:val="false"/>
               <w:widowControl w:val="false"/>
-              <w:pBdr/>
               <w:shd w:val="clear" w:fill="auto"/>
               <w:spacing w:lineRule="auto" w:line="240" w:before="0" w:after="0"/>
               <w:ind w:hanging="0" w:left="0" w:right="0"/>
@@ -6522,7 +6221,6 @@
               <w:keepNext w:val="false"/>
               <w:keepLines w:val="false"/>
               <w:widowControl w:val="false"/>
-              <w:pBdr/>
               <w:shd w:val="clear" w:fill="auto"/>
               <w:spacing w:lineRule="auto" w:line="240" w:before="0" w:after="0"/>
               <w:ind w:hanging="0" w:left="0" w:right="0"/>
@@ -6550,7 +6248,6 @@
               <w:keepNext w:val="false"/>
               <w:keepLines w:val="false"/>
               <w:widowControl w:val="false"/>
-              <w:pBdr/>
               <w:shd w:val="clear" w:fill="auto"/>
               <w:spacing w:lineRule="auto" w:line="240" w:before="0" w:after="0"/>
               <w:ind w:hanging="0" w:left="0" w:right="0"/>
@@ -6578,7 +6275,6 @@
               <w:keepNext w:val="false"/>
               <w:keepLines w:val="false"/>
               <w:widowControl w:val="false"/>
-              <w:pBdr/>
               <w:shd w:val="clear" w:fill="auto"/>
               <w:spacing w:lineRule="auto" w:line="240" w:before="0" w:after="0"/>
               <w:ind w:hanging="0" w:left="0" w:right="0"/>
@@ -6606,7 +6302,6 @@
               <w:keepNext w:val="false"/>
               <w:keepLines w:val="false"/>
               <w:widowControl w:val="false"/>
-              <w:pBdr/>
               <w:shd w:val="clear" w:fill="auto"/>
               <w:spacing w:lineRule="auto" w:line="240" w:before="0" w:after="0"/>
               <w:ind w:hanging="0" w:left="0" w:right="0"/>
@@ -6634,7 +6329,6 @@
               <w:keepNext w:val="false"/>
               <w:keepLines w:val="false"/>
               <w:widowControl w:val="false"/>
-              <w:pBdr/>
               <w:shd w:val="clear" w:fill="auto"/>
               <w:spacing w:lineRule="auto" w:line="240" w:before="0" w:after="0"/>
               <w:ind w:hanging="0" w:left="0" w:right="0"/>
@@ -6662,7 +6356,6 @@
               <w:keepNext w:val="false"/>
               <w:keepLines w:val="false"/>
               <w:widowControl w:val="false"/>
-              <w:pBdr/>
               <w:shd w:val="clear" w:fill="auto"/>
               <w:spacing w:lineRule="auto" w:line="240" w:before="0" w:after="0"/>
               <w:ind w:hanging="0" w:left="0" w:right="0"/>
@@ -6690,7 +6383,6 @@
               <w:keepNext w:val="false"/>
               <w:keepLines w:val="false"/>
               <w:widowControl w:val="false"/>
-              <w:pBdr/>
               <w:shd w:val="clear" w:fill="auto"/>
               <w:spacing w:lineRule="auto" w:line="240" w:before="0" w:after="0"/>
               <w:ind w:hanging="0" w:left="0" w:right="0"/>
@@ -6718,7 +6410,6 @@
               <w:keepNext w:val="false"/>
               <w:keepLines w:val="false"/>
               <w:widowControl w:val="false"/>
-              <w:pBdr/>
               <w:shd w:val="clear" w:fill="auto"/>
               <w:spacing w:lineRule="auto" w:line="240" w:before="0" w:after="0"/>
               <w:ind w:hanging="0" w:left="0" w:right="0"/>
@@ -6746,7 +6437,6 @@
               <w:keepNext w:val="false"/>
               <w:keepLines w:val="false"/>
               <w:widowControl w:val="false"/>
-              <w:pBdr/>
               <w:shd w:val="clear" w:fill="auto"/>
               <w:spacing w:lineRule="auto" w:line="240" w:before="0" w:after="0"/>
               <w:ind w:hanging="0" w:left="0" w:right="0"/>
@@ -6774,7 +6464,6 @@
               <w:keepNext w:val="false"/>
               <w:keepLines w:val="false"/>
               <w:widowControl w:val="false"/>
-              <w:pBdr/>
               <w:shd w:val="clear" w:fill="auto"/>
               <w:spacing w:lineRule="auto" w:line="240" w:before="0" w:after="0"/>
               <w:ind w:hanging="0" w:left="0" w:right="0"/>
@@ -6802,7 +6491,6 @@
               <w:keepNext w:val="false"/>
               <w:keepLines w:val="false"/>
               <w:widowControl w:val="false"/>
-              <w:pBdr/>
               <w:shd w:val="clear" w:fill="auto"/>
               <w:spacing w:lineRule="auto" w:line="240" w:before="0" w:after="0"/>
               <w:ind w:hanging="0" w:left="0" w:right="0"/>
@@ -6830,7 +6518,6 @@
               <w:keepNext w:val="false"/>
               <w:keepLines w:val="false"/>
               <w:widowControl w:val="false"/>
-              <w:pBdr/>
               <w:shd w:val="clear" w:fill="auto"/>
               <w:spacing w:lineRule="auto" w:line="240" w:before="0" w:after="0"/>
               <w:ind w:hanging="0" w:left="0" w:right="0"/>
@@ -6858,7 +6545,6 @@
               <w:keepNext w:val="false"/>
               <w:keepLines w:val="false"/>
               <w:widowControl w:val="false"/>
-              <w:pBdr/>
               <w:shd w:val="clear" w:fill="auto"/>
               <w:spacing w:lineRule="auto" w:line="240" w:before="0" w:after="0"/>
               <w:ind w:hanging="0" w:left="0" w:right="0"/>
@@ -6886,7 +6572,6 @@
               <w:keepNext w:val="false"/>
               <w:keepLines w:val="false"/>
               <w:widowControl w:val="false"/>
-              <w:pBdr/>
               <w:shd w:val="clear" w:fill="auto"/>
               <w:spacing w:lineRule="auto" w:line="240" w:before="0" w:after="0"/>
               <w:ind w:hanging="0" w:left="0" w:right="0"/>
@@ -7052,7 +6737,6 @@
               <w:keepNext w:val="false"/>
               <w:keepLines w:val="false"/>
               <w:widowControl w:val="false"/>
-              <w:pBdr/>
               <w:shd w:val="clear" w:fill="auto"/>
               <w:spacing w:lineRule="auto" w:line="240" w:before="0" w:after="0"/>
               <w:ind w:hanging="0" w:left="0" w:right="0"/>
@@ -7070,7 +6754,6 @@
               <w:keepNext w:val="false"/>
               <w:keepLines w:val="false"/>
               <w:widowControl w:val="false"/>
-              <w:pBdr/>
               <w:shd w:val="clear" w:fill="auto"/>
               <w:spacing w:lineRule="auto" w:line="240" w:before="0" w:after="0"/>
               <w:ind w:hanging="0" w:left="0" w:right="0"/>
@@ -7092,7 +6775,6 @@
               <w:keepNext w:val="false"/>
               <w:keepLines w:val="false"/>
               <w:widowControl w:val="false"/>
-              <w:pBdr/>
               <w:shd w:val="clear" w:fill="auto"/>
               <w:spacing w:lineRule="auto" w:line="240" w:before="0" w:after="0"/>
               <w:ind w:hanging="0" w:left="0" w:right="0"/>
@@ -7114,7 +6796,6 @@
               <w:keepNext w:val="false"/>
               <w:keepLines w:val="false"/>
               <w:widowControl w:val="false"/>
-              <w:pBdr/>
               <w:shd w:val="clear" w:fill="auto"/>
               <w:spacing w:lineRule="auto" w:line="240" w:before="0" w:after="0"/>
               <w:ind w:hanging="0" w:left="0" w:right="0"/>
@@ -7201,7 +6882,6 @@
               <w:keepNext w:val="false"/>
               <w:keepLines w:val="false"/>
               <w:widowControl w:val="false"/>
-              <w:pBdr/>
               <w:shd w:val="clear" w:fill="auto"/>
               <w:spacing w:lineRule="auto" w:line="240" w:before="0" w:after="0"/>
               <w:ind w:hanging="0" w:left="0" w:right="0"/>
@@ -7219,7 +6899,6 @@
               <w:keepNext w:val="false"/>
               <w:keepLines w:val="false"/>
               <w:widowControl w:val="false"/>
-              <w:pBdr/>
               <w:shd w:val="clear" w:fill="auto"/>
               <w:spacing w:lineRule="auto" w:line="240" w:before="0" w:after="0"/>
               <w:ind w:hanging="0" w:left="0" w:right="0"/>
@@ -7241,7 +6920,6 @@
               <w:keepNext w:val="false"/>
               <w:keepLines w:val="false"/>
               <w:widowControl w:val="false"/>
-              <w:pBdr/>
               <w:shd w:val="clear" w:fill="auto"/>
               <w:spacing w:lineRule="auto" w:line="240" w:before="0" w:after="0"/>
               <w:ind w:hanging="0" w:left="0" w:right="0"/>
@@ -7263,7 +6941,6 @@
               <w:keepNext w:val="false"/>
               <w:keepLines w:val="false"/>
               <w:widowControl w:val="false"/>
-              <w:pBdr/>
               <w:shd w:val="clear" w:fill="auto"/>
               <w:spacing w:lineRule="auto" w:line="240" w:before="0" w:after="0"/>
               <w:ind w:hanging="0" w:left="0" w:right="0"/>
@@ -7285,7 +6962,6 @@
               <w:keepNext w:val="false"/>
               <w:keepLines w:val="false"/>
               <w:widowControl w:val="false"/>
-              <w:pBdr/>
               <w:shd w:val="clear" w:fill="auto"/>
               <w:spacing w:lineRule="auto" w:line="240" w:before="0" w:after="0"/>
               <w:ind w:hanging="0" w:left="0" w:right="0"/>
@@ -7330,19 +7006,7 @@
       </w:pPr>
       <w:r>
         <w:rPr/>
-        <w:t xml:space="preserve">Now let’s add some comments to </w:t>
-      </w:r>
-      <w:r>
-        <w:rPr/>
-        <w:t>our</w:t>
-      </w:r>
-      <w:r>
-        <w:rPr/>
-        <w:t xml:space="preserve"> blog</w:t>
-      </w:r>
-      <w:r>
-        <w:rPr/>
-        <w:t>s.</w:t>
+        <w:t>Now let’s add some comments to our blogs.</w:t>
       </w:r>
     </w:p>
     <w:p>
@@ -7474,7 +7138,6 @@
               <w:keepNext w:val="false"/>
               <w:keepLines w:val="false"/>
               <w:widowControl w:val="false"/>
-              <w:pBdr/>
               <w:shd w:val="clear" w:fill="auto"/>
               <w:spacing w:lineRule="auto" w:line="240" w:before="0" w:after="0"/>
               <w:ind w:hanging="0" w:left="0" w:right="0"/>
@@ -7492,7 +7155,6 @@
               <w:keepNext w:val="false"/>
               <w:keepLines w:val="false"/>
               <w:widowControl w:val="false"/>
-              <w:pBdr/>
               <w:shd w:val="clear" w:fill="auto"/>
               <w:spacing w:lineRule="auto" w:line="240" w:before="0" w:after="0"/>
               <w:ind w:hanging="0" w:left="0" w:right="0"/>
@@ -7514,7 +7176,6 @@
               <w:keepNext w:val="false"/>
               <w:keepLines w:val="false"/>
               <w:widowControl w:val="false"/>
-              <w:pBdr/>
               <w:shd w:val="clear" w:fill="auto"/>
               <w:spacing w:lineRule="auto" w:line="240" w:before="0" w:after="0"/>
               <w:ind w:hanging="0" w:left="0" w:right="0"/>
@@ -7536,7 +7197,6 @@
               <w:keepNext w:val="false"/>
               <w:keepLines w:val="false"/>
               <w:widowControl w:val="false"/>
-              <w:pBdr/>
               <w:shd w:val="clear" w:fill="auto"/>
               <w:spacing w:lineRule="auto" w:line="240" w:before="0" w:after="0"/>
               <w:ind w:hanging="0" w:left="0" w:right="0"/>
@@ -7558,7 +7218,6 @@
               <w:keepNext w:val="false"/>
               <w:keepLines w:val="false"/>
               <w:widowControl w:val="false"/>
-              <w:pBdr/>
               <w:shd w:val="clear" w:fill="auto"/>
               <w:spacing w:lineRule="auto" w:line="240" w:before="0" w:after="0"/>
               <w:ind w:hanging="0" w:left="0" w:right="0"/>
@@ -7580,7 +7239,6 @@
               <w:keepNext w:val="false"/>
               <w:keepLines w:val="false"/>
               <w:widowControl w:val="false"/>
-              <w:pBdr/>
               <w:shd w:val="clear" w:fill="auto"/>
               <w:spacing w:lineRule="auto" w:line="240" w:before="0" w:after="0"/>
               <w:ind w:hanging="0" w:left="0" w:right="0"/>
@@ -7602,7 +7260,22 @@
               <w:keepNext w:val="false"/>
               <w:keepLines w:val="false"/>
               <w:widowControl w:val="false"/>
-              <w:pBdr/>
+              <w:shd w:val="clear" w:fill="auto"/>
+              <w:spacing w:lineRule="auto" w:line="240" w:before="0" w:after="0"/>
+              <w:ind w:hanging="0" w:left="0" w:right="0"/>
+              <w:jc w:val="left"/>
+              <w:rPr/>
+            </w:pPr>
+            <w:r>
+              <w:rPr/>
+            </w:r>
+          </w:p>
+          <w:p>
+            <w:pPr>
+              <w:pStyle w:val="normal1"/>
+              <w:keepNext w:val="false"/>
+              <w:keepLines w:val="false"/>
+              <w:widowControl w:val="false"/>
               <w:shd w:val="clear" w:fill="auto"/>
               <w:spacing w:lineRule="auto" w:line="240" w:before="0" w:after="0"/>
               <w:ind w:hanging="0" w:left="0" w:right="0"/>
@@ -7613,24 +7286,6 @@
               <w:rPr/>
               <w:t xml:space="preserve">  </w:t>
             </w:r>
-          </w:p>
-          <w:p>
-            <w:pPr>
-              <w:pStyle w:val="normal1"/>
-              <w:keepNext w:val="false"/>
-              <w:keepLines w:val="false"/>
-              <w:widowControl w:val="false"/>
-              <w:pBdr/>
-              <w:shd w:val="clear" w:fill="auto"/>
-              <w:spacing w:lineRule="auto" w:line="240" w:before="0" w:after="0"/>
-              <w:ind w:hanging="0" w:left="0" w:right="0"/>
-              <w:jc w:val="left"/>
-              <w:rPr/>
-            </w:pPr>
-            <w:r>
-              <w:rPr/>
-              <w:t xml:space="preserve">  </w:t>
-            </w:r>
             <w:r>
               <w:rPr/>
               <w:t>"content": "Same here!"</w:t>
@@ -7642,7 +7297,6 @@
               <w:keepNext w:val="false"/>
               <w:keepLines w:val="false"/>
               <w:widowControl w:val="false"/>
-              <w:pBdr/>
               <w:shd w:val="clear" w:fill="auto"/>
               <w:spacing w:lineRule="auto" w:line="240" w:before="0" w:after="0"/>
               <w:ind w:hanging="0" w:left="0" w:right="0"/>
@@ -7726,7 +7380,6 @@
               <w:keepNext w:val="false"/>
               <w:keepLines w:val="false"/>
               <w:widowControl w:val="false"/>
-              <w:pBdr/>
               <w:shd w:val="clear" w:fill="auto"/>
               <w:spacing w:lineRule="auto" w:line="240" w:before="0" w:after="0"/>
               <w:ind w:hanging="0" w:left="0" w:right="0"/>
@@ -7744,7 +7397,6 @@
               <w:keepNext w:val="false"/>
               <w:keepLines w:val="false"/>
               <w:widowControl w:val="false"/>
-              <w:pBdr/>
               <w:shd w:val="clear" w:fill="auto"/>
               <w:spacing w:lineRule="auto" w:line="240" w:before="0" w:after="0"/>
               <w:ind w:hanging="0" w:left="0" w:right="0"/>
@@ -7766,7 +7418,6 @@
               <w:keepNext w:val="false"/>
               <w:keepLines w:val="false"/>
               <w:widowControl w:val="false"/>
-              <w:pBdr/>
               <w:shd w:val="clear" w:fill="auto"/>
               <w:spacing w:lineRule="auto" w:line="240" w:before="0" w:after="0"/>
               <w:ind w:hanging="0" w:left="0" w:right="0"/>
@@ -7788,7 +7439,6 @@
               <w:keepNext w:val="false"/>
               <w:keepLines w:val="false"/>
               <w:widowControl w:val="false"/>
-              <w:pBdr/>
               <w:shd w:val="clear" w:fill="auto"/>
               <w:spacing w:lineRule="auto" w:line="240" w:before="0" w:after="0"/>
               <w:ind w:hanging="0" w:left="0" w:right="0"/>
@@ -7810,7 +7460,6 @@
               <w:keepNext w:val="false"/>
               <w:keepLines w:val="false"/>
               <w:widowControl w:val="false"/>
-              <w:pBdr/>
               <w:shd w:val="clear" w:fill="auto"/>
               <w:spacing w:lineRule="auto" w:line="240" w:before="0" w:after="0"/>
               <w:ind w:hanging="0" w:left="0" w:right="0"/>
@@ -7832,7 +7481,6 @@
               <w:keepNext w:val="false"/>
               <w:keepLines w:val="false"/>
               <w:widowControl w:val="false"/>
-              <w:pBdr/>
               <w:shd w:val="clear" w:fill="auto"/>
               <w:spacing w:lineRule="auto" w:line="240" w:before="0" w:after="0"/>
               <w:ind w:hanging="0" w:left="0" w:right="0"/>
@@ -7854,7 +7502,6 @@
               <w:keepNext w:val="false"/>
               <w:keepLines w:val="false"/>
               <w:widowControl w:val="false"/>
-              <w:pBdr/>
               <w:shd w:val="clear" w:fill="auto"/>
               <w:spacing w:lineRule="auto" w:line="240" w:before="0" w:after="0"/>
               <w:ind w:hanging="0" w:left="0" w:right="0"/>
@@ -7876,7 +7523,6 @@
               <w:keepNext w:val="false"/>
               <w:keepLines w:val="false"/>
               <w:widowControl w:val="false"/>
-              <w:pBdr/>
               <w:shd w:val="clear" w:fill="auto"/>
               <w:spacing w:lineRule="auto" w:line="240" w:before="0" w:after="0"/>
               <w:ind w:hanging="0" w:left="0" w:right="0"/>
@@ -7898,7 +7544,6 @@
               <w:keepNext w:val="false"/>
               <w:keepLines w:val="false"/>
               <w:widowControl w:val="false"/>
-              <w:pBdr/>
               <w:shd w:val="clear" w:fill="auto"/>
               <w:spacing w:lineRule="auto" w:line="240" w:before="0" w:after="0"/>
               <w:ind w:hanging="0" w:left="0" w:right="0"/>
@@ -7920,7 +7565,6 @@
               <w:keepNext w:val="false"/>
               <w:keepLines w:val="false"/>
               <w:widowControl w:val="false"/>
-              <w:pBdr/>
               <w:shd w:val="clear" w:fill="auto"/>
               <w:spacing w:lineRule="auto" w:line="240" w:before="0" w:after="0"/>
               <w:ind w:hanging="0" w:left="0" w:right="0"/>
@@ -7942,7 +7586,6 @@
               <w:keepNext w:val="false"/>
               <w:keepLines w:val="false"/>
               <w:widowControl w:val="false"/>
-              <w:pBdr/>
               <w:shd w:val="clear" w:fill="auto"/>
               <w:spacing w:lineRule="auto" w:line="240" w:before="0" w:after="0"/>
               <w:ind w:hanging="0" w:left="0" w:right="0"/>
@@ -7964,7 +7607,6 @@
               <w:keepNext w:val="false"/>
               <w:keepLines w:val="false"/>
               <w:widowControl w:val="false"/>
-              <w:pBdr/>
               <w:shd w:val="clear" w:fill="auto"/>
               <w:spacing w:lineRule="auto" w:line="240" w:before="0" w:after="0"/>
               <w:ind w:hanging="0" w:left="0" w:right="0"/>
@@ -7986,7 +7628,6 @@
               <w:keepNext w:val="false"/>
               <w:keepLines w:val="false"/>
               <w:widowControl w:val="false"/>
-              <w:pBdr/>
               <w:shd w:val="clear" w:fill="auto"/>
               <w:spacing w:lineRule="auto" w:line="240" w:before="0" w:after="0"/>
               <w:ind w:hanging="0" w:left="0" w:right="0"/>
@@ -8008,7 +7649,6 @@
               <w:keepNext w:val="false"/>
               <w:keepLines w:val="false"/>
               <w:widowControl w:val="false"/>
-              <w:pBdr/>
               <w:shd w:val="clear" w:fill="auto"/>
               <w:spacing w:lineRule="auto" w:line="240" w:before="0" w:after="0"/>
               <w:ind w:hanging="0" w:left="0" w:right="0"/>
@@ -8030,7 +7670,6 @@
               <w:keepNext w:val="false"/>
               <w:keepLines w:val="false"/>
               <w:widowControl w:val="false"/>
-              <w:pBdr/>
               <w:shd w:val="clear" w:fill="auto"/>
               <w:spacing w:lineRule="auto" w:line="240" w:before="0" w:after="0"/>
               <w:ind w:hanging="0" w:left="0" w:right="0"/>
@@ -8052,7 +7691,6 @@
               <w:keepNext w:val="false"/>
               <w:keepLines w:val="false"/>
               <w:widowControl w:val="false"/>
-              <w:pBdr/>
               <w:shd w:val="clear" w:fill="auto"/>
               <w:spacing w:lineRule="auto" w:line="240" w:before="0" w:after="0"/>
               <w:ind w:hanging="0" w:left="0" w:right="0"/>
@@ -8074,7 +7712,6 @@
               <w:keepNext w:val="false"/>
               <w:keepLines w:val="false"/>
               <w:widowControl w:val="false"/>
-              <w:pBdr/>
               <w:shd w:val="clear" w:fill="auto"/>
               <w:spacing w:lineRule="auto" w:line="240" w:before="0" w:after="0"/>
               <w:ind w:hanging="0" w:left="0" w:right="0"/>
@@ -8096,7 +7733,6 @@
               <w:keepNext w:val="false"/>
               <w:keepLines w:val="false"/>
               <w:widowControl w:val="false"/>
-              <w:pBdr/>
               <w:shd w:val="clear" w:fill="auto"/>
               <w:spacing w:lineRule="auto" w:line="240" w:before="0" w:after="0"/>
               <w:ind w:hanging="0" w:left="0" w:right="0"/>
@@ -8118,7 +7754,6 @@
               <w:keepNext w:val="false"/>
               <w:keepLines w:val="false"/>
               <w:widowControl w:val="false"/>
-              <w:pBdr/>
               <w:shd w:val="clear" w:fill="auto"/>
               <w:spacing w:lineRule="auto" w:line="240" w:before="0" w:after="0"/>
               <w:ind w:hanging="0" w:left="0" w:right="0"/>
@@ -8140,7 +7775,6 @@
               <w:keepNext w:val="false"/>
               <w:keepLines w:val="false"/>
               <w:widowControl w:val="false"/>
-              <w:pBdr/>
               <w:shd w:val="clear" w:fill="auto"/>
               <w:spacing w:lineRule="auto" w:line="240" w:before="0" w:after="0"/>
               <w:ind w:hanging="0" w:left="0" w:right="0"/>
@@ -8162,7 +7796,6 @@
               <w:keepNext w:val="false"/>
               <w:keepLines w:val="false"/>
               <w:widowControl w:val="false"/>
-              <w:pBdr/>
               <w:shd w:val="clear" w:fill="auto"/>
               <w:spacing w:lineRule="auto" w:line="240" w:before="0" w:after="0"/>
               <w:ind w:hanging="0" w:left="0" w:right="0"/>
@@ -8184,7 +7817,6 @@
               <w:keepNext w:val="false"/>
               <w:keepLines w:val="false"/>
               <w:widowControl w:val="false"/>
-              <w:pBdr/>
               <w:shd w:val="clear" w:fill="auto"/>
               <w:spacing w:lineRule="auto" w:line="240" w:before="0" w:after="0"/>
               <w:ind w:hanging="0" w:left="0" w:right="0"/>
@@ -8206,7 +7838,6 @@
               <w:keepNext w:val="false"/>
               <w:keepLines w:val="false"/>
               <w:widowControl w:val="false"/>
-              <w:pBdr/>
               <w:shd w:val="clear" w:fill="auto"/>
               <w:spacing w:lineRule="auto" w:line="240" w:before="0" w:after="0"/>
               <w:ind w:hanging="0" w:left="0" w:right="0"/>
@@ -8228,7 +7859,6 @@
               <w:keepNext w:val="false"/>
               <w:keepLines w:val="false"/>
               <w:widowControl w:val="false"/>
-              <w:pBdr/>
               <w:shd w:val="clear" w:fill="auto"/>
               <w:spacing w:lineRule="auto" w:line="240" w:before="0" w:after="0"/>
               <w:ind w:hanging="0" w:left="0" w:right="0"/>
@@ -8250,7 +7880,6 @@
               <w:keepNext w:val="false"/>
               <w:keepLines w:val="false"/>
               <w:widowControl w:val="false"/>
-              <w:pBdr/>
               <w:shd w:val="clear" w:fill="auto"/>
               <w:spacing w:lineRule="auto" w:line="240" w:before="0" w:after="0"/>
               <w:ind w:hanging="0" w:left="0" w:right="0"/>
@@ -8272,7 +7901,6 @@
               <w:keepNext w:val="false"/>
               <w:keepLines w:val="false"/>
               <w:widowControl w:val="false"/>
-              <w:pBdr/>
               <w:shd w:val="clear" w:fill="auto"/>
               <w:spacing w:lineRule="auto" w:line="240" w:before="0" w:after="0"/>
               <w:ind w:hanging="0" w:left="0" w:right="0"/>
@@ -8294,7 +7922,6 @@
               <w:keepNext w:val="false"/>
               <w:keepLines w:val="false"/>
               <w:widowControl w:val="false"/>
-              <w:pBdr/>
               <w:shd w:val="clear" w:fill="auto"/>
               <w:spacing w:lineRule="auto" w:line="240" w:before="0" w:after="0"/>
               <w:ind w:hanging="0" w:left="0" w:right="0"/>
@@ -8316,7 +7943,6 @@
               <w:keepNext w:val="false"/>
               <w:keepLines w:val="false"/>
               <w:widowControl w:val="false"/>
-              <w:pBdr/>
               <w:shd w:val="clear" w:fill="auto"/>
               <w:spacing w:lineRule="auto" w:line="240" w:before="0" w:after="0"/>
               <w:ind w:hanging="0" w:left="0" w:right="0"/>
@@ -8338,7 +7964,6 @@
               <w:keepNext w:val="false"/>
               <w:keepLines w:val="false"/>
               <w:widowControl w:val="false"/>
-              <w:pBdr/>
               <w:shd w:val="clear" w:fill="auto"/>
               <w:spacing w:lineRule="auto" w:line="240" w:before="0" w:after="0"/>
               <w:ind w:hanging="0" w:left="0" w:right="0"/>
@@ -8360,7 +7985,6 @@
               <w:keepNext w:val="false"/>
               <w:keepLines w:val="false"/>
               <w:widowControl w:val="false"/>
-              <w:pBdr/>
               <w:shd w:val="clear" w:fill="auto"/>
               <w:spacing w:lineRule="auto" w:line="240" w:before="0" w:after="0"/>
               <w:ind w:hanging="0" w:left="0" w:right="0"/>
@@ -8382,7 +8006,6 @@
               <w:keepNext w:val="false"/>
               <w:keepLines w:val="false"/>
               <w:widowControl w:val="false"/>
-              <w:pBdr/>
               <w:shd w:val="clear" w:fill="auto"/>
               <w:spacing w:lineRule="auto" w:line="240" w:before="0" w:after="0"/>
               <w:ind w:hanging="0" w:left="0" w:right="0"/>
@@ -8404,7 +8027,6 @@
               <w:keepNext w:val="false"/>
               <w:keepLines w:val="false"/>
               <w:widowControl w:val="false"/>
-              <w:pBdr/>
               <w:shd w:val="clear" w:fill="auto"/>
               <w:spacing w:lineRule="auto" w:line="240" w:before="0" w:after="0"/>
               <w:ind w:hanging="0" w:left="0" w:right="0"/>
@@ -8422,7 +8044,6 @@
               <w:keepNext w:val="false"/>
               <w:keepLines w:val="false"/>
               <w:widowControl w:val="false"/>
-              <w:pBdr/>
               <w:shd w:val="clear" w:fill="auto"/>
               <w:spacing w:lineRule="auto" w:line="240" w:before="0" w:after="0"/>
               <w:ind w:hanging="0" w:left="0" w:right="0"/>
@@ -8598,7 +8219,6 @@
               <w:keepNext w:val="false"/>
               <w:keepLines w:val="false"/>
               <w:widowControl w:val="false"/>
-              <w:pBdr/>
               <w:shd w:val="clear" w:fill="auto"/>
               <w:spacing w:lineRule="auto" w:line="240" w:before="0" w:after="0"/>
               <w:ind w:hanging="0" w:left="0" w:right="0"/>
@@ -8616,7 +8236,6 @@
               <w:keepNext w:val="false"/>
               <w:keepLines w:val="false"/>
               <w:widowControl w:val="false"/>
-              <w:pBdr/>
               <w:shd w:val="clear" w:fill="auto"/>
               <w:spacing w:lineRule="auto" w:line="240" w:before="0" w:after="0"/>
               <w:ind w:hanging="0" w:left="0" w:right="0"/>
@@ -8638,7 +8257,6 @@
               <w:keepNext w:val="false"/>
               <w:keepLines w:val="false"/>
               <w:widowControl w:val="false"/>
-              <w:pBdr/>
               <w:shd w:val="clear" w:fill="auto"/>
               <w:spacing w:lineRule="auto" w:line="240" w:before="0" w:after="0"/>
               <w:ind w:hanging="0" w:left="0" w:right="0"/>
@@ -8660,7 +8278,6 @@
               <w:keepNext w:val="false"/>
               <w:keepLines w:val="false"/>
               <w:widowControl w:val="false"/>
-              <w:pBdr/>
               <w:shd w:val="clear" w:fill="auto"/>
               <w:spacing w:lineRule="auto" w:line="240" w:before="0" w:after="0"/>
               <w:ind w:hanging="0" w:left="0" w:right="0"/>
@@ -8682,7 +8299,6 @@
               <w:keepNext w:val="false"/>
               <w:keepLines w:val="false"/>
               <w:widowControl w:val="false"/>
-              <w:pBdr/>
               <w:shd w:val="clear" w:fill="auto"/>
               <w:spacing w:lineRule="auto" w:line="240" w:before="0" w:after="0"/>
               <w:ind w:hanging="0" w:left="0" w:right="0"/>
@@ -8704,7 +8320,6 @@
               <w:keepNext w:val="false"/>
               <w:keepLines w:val="false"/>
               <w:widowControl w:val="false"/>
-              <w:pBdr/>
               <w:shd w:val="clear" w:fill="auto"/>
               <w:spacing w:lineRule="auto" w:line="240" w:before="0" w:after="0"/>
               <w:ind w:hanging="0" w:left="0" w:right="0"/>
@@ -8726,7 +8341,6 @@
               <w:keepNext w:val="false"/>
               <w:keepLines w:val="false"/>
               <w:widowControl w:val="false"/>
-              <w:pBdr/>
               <w:shd w:val="clear" w:fill="auto"/>
               <w:spacing w:lineRule="auto" w:line="240" w:before="0" w:after="0"/>
               <w:ind w:hanging="0" w:left="0" w:right="0"/>
@@ -8748,7 +8362,6 @@
               <w:keepNext w:val="false"/>
               <w:keepLines w:val="false"/>
               <w:widowControl w:val="false"/>
-              <w:pBdr/>
               <w:shd w:val="clear" w:fill="auto"/>
               <w:spacing w:lineRule="auto" w:line="240" w:before="0" w:after="0"/>
               <w:ind w:hanging="0" w:left="0" w:right="0"/>
@@ -8770,7 +8383,6 @@
               <w:keepNext w:val="false"/>
               <w:keepLines w:val="false"/>
               <w:widowControl w:val="false"/>
-              <w:pBdr/>
               <w:shd w:val="clear" w:fill="auto"/>
               <w:spacing w:lineRule="auto" w:line="240" w:before="0" w:after="0"/>
               <w:ind w:hanging="0" w:left="0" w:right="0"/>
@@ -8853,7 +8465,6 @@
               <w:keepNext w:val="false"/>
               <w:keepLines w:val="false"/>
               <w:widowControl w:val="false"/>
-              <w:pBdr/>
               <w:shd w:val="clear" w:fill="auto"/>
               <w:spacing w:lineRule="auto" w:line="240" w:before="0" w:after="0"/>
               <w:ind w:hanging="0" w:left="0" w:right="0"/>
@@ -8871,7 +8482,6 @@
               <w:keepNext w:val="false"/>
               <w:keepLines w:val="false"/>
               <w:widowControl w:val="false"/>
-              <w:pBdr/>
               <w:shd w:val="clear" w:fill="auto"/>
               <w:spacing w:lineRule="auto" w:line="240" w:before="0" w:after="0"/>
               <w:ind w:hanging="0" w:left="0" w:right="0"/>
@@ -8893,7 +8503,6 @@
               <w:keepNext w:val="false"/>
               <w:keepLines w:val="false"/>
               <w:widowControl w:val="false"/>
-              <w:pBdr/>
               <w:shd w:val="clear" w:fill="auto"/>
               <w:spacing w:lineRule="auto" w:line="240" w:before="0" w:after="0"/>
               <w:ind w:hanging="0" w:left="0" w:right="0"/>
@@ -8915,7 +8524,6 @@
               <w:keepNext w:val="false"/>
               <w:keepLines w:val="false"/>
               <w:widowControl w:val="false"/>
-              <w:pBdr/>
               <w:shd w:val="clear" w:fill="auto"/>
               <w:spacing w:lineRule="auto" w:line="240" w:before="0" w:after="0"/>
               <w:ind w:hanging="0" w:left="0" w:right="0"/>
@@ -8937,7 +8545,6 @@
               <w:keepNext w:val="false"/>
               <w:keepLines w:val="false"/>
               <w:widowControl w:val="false"/>
-              <w:pBdr/>
               <w:shd w:val="clear" w:fill="auto"/>
               <w:spacing w:lineRule="auto" w:line="240" w:before="0" w:after="0"/>
               <w:ind w:hanging="0" w:left="0" w:right="0"/>
@@ -8959,7 +8566,6 @@
               <w:keepNext w:val="false"/>
               <w:keepLines w:val="false"/>
               <w:widowControl w:val="false"/>
-              <w:pBdr/>
               <w:shd w:val="clear" w:fill="auto"/>
               <w:spacing w:lineRule="auto" w:line="240" w:before="0" w:after="0"/>
               <w:ind w:hanging="0" w:left="0" w:right="0"/>
@@ -8981,7 +8587,6 @@
               <w:keepNext w:val="false"/>
               <w:keepLines w:val="false"/>
               <w:widowControl w:val="false"/>
-              <w:pBdr/>
               <w:shd w:val="clear" w:fill="auto"/>
               <w:spacing w:lineRule="auto" w:line="240" w:before="0" w:after="0"/>
               <w:ind w:hanging="0" w:left="0" w:right="0"/>
@@ -9003,7 +8608,6 @@
               <w:keepNext w:val="false"/>
               <w:keepLines w:val="false"/>
               <w:widowControl w:val="false"/>
-              <w:pBdr/>
               <w:shd w:val="clear" w:fill="auto"/>
               <w:spacing w:lineRule="auto" w:line="240" w:before="0" w:after="0"/>
               <w:ind w:hanging="0" w:left="0" w:right="0"/>
@@ -9025,7 +8629,6 @@
               <w:keepNext w:val="false"/>
               <w:keepLines w:val="false"/>
               <w:widowControl w:val="false"/>
-              <w:pBdr/>
               <w:shd w:val="clear" w:fill="auto"/>
               <w:spacing w:lineRule="auto" w:line="240" w:before="0" w:after="0"/>
               <w:ind w:hanging="0" w:left="0" w:right="0"/>
@@ -9047,7 +8650,6 @@
               <w:keepNext w:val="false"/>
               <w:keepLines w:val="false"/>
               <w:widowControl w:val="false"/>
-              <w:pBdr/>
               <w:shd w:val="clear" w:fill="auto"/>
               <w:spacing w:lineRule="auto" w:line="240" w:before="0" w:after="0"/>
               <w:ind w:hanging="0" w:left="0" w:right="0"/>
@@ -9069,7 +8671,6 @@
               <w:keepNext w:val="false"/>
               <w:keepLines w:val="false"/>
               <w:widowControl w:val="false"/>
-              <w:pBdr/>
               <w:shd w:val="clear" w:fill="auto"/>
               <w:spacing w:lineRule="auto" w:line="240" w:before="0" w:after="0"/>
               <w:ind w:hanging="0" w:left="0" w:right="0"/>
@@ -9091,7 +8692,6 @@
               <w:keepNext w:val="false"/>
               <w:keepLines w:val="false"/>
               <w:widowControl w:val="false"/>
-              <w:pBdr/>
               <w:shd w:val="clear" w:fill="auto"/>
               <w:spacing w:lineRule="auto" w:line="240" w:before="0" w:after="0"/>
               <w:ind w:hanging="0" w:left="0" w:right="0"/>
@@ -9113,7 +8713,6 @@
               <w:keepNext w:val="false"/>
               <w:keepLines w:val="false"/>
               <w:widowControl w:val="false"/>
-              <w:pBdr/>
               <w:shd w:val="clear" w:fill="auto"/>
               <w:spacing w:lineRule="auto" w:line="240" w:before="0" w:after="0"/>
               <w:ind w:hanging="0" w:left="0" w:right="0"/>
@@ -9135,7 +8734,6 @@
               <w:keepNext w:val="false"/>
               <w:keepLines w:val="false"/>
               <w:widowControl w:val="false"/>
-              <w:pBdr/>
               <w:shd w:val="clear" w:fill="auto"/>
               <w:spacing w:lineRule="auto" w:line="240" w:before="0" w:after="0"/>
               <w:ind w:hanging="0" w:left="0" w:right="0"/>
@@ -9157,7 +8755,6 @@
               <w:keepNext w:val="false"/>
               <w:keepLines w:val="false"/>
               <w:widowControl w:val="false"/>
-              <w:pBdr/>
               <w:shd w:val="clear" w:fill="auto"/>
               <w:spacing w:lineRule="auto" w:line="240" w:before="0" w:after="0"/>
               <w:ind w:hanging="0" w:left="0" w:right="0"/>
@@ -9179,7 +8776,6 @@
               <w:keepNext w:val="false"/>
               <w:keepLines w:val="false"/>
               <w:widowControl w:val="false"/>
-              <w:pBdr/>
               <w:shd w:val="clear" w:fill="auto"/>
               <w:spacing w:lineRule="auto" w:line="240" w:before="0" w:after="0"/>
               <w:ind w:hanging="0" w:left="0" w:right="0"/>
@@ -9201,7 +8797,6 @@
               <w:keepNext w:val="false"/>
               <w:keepLines w:val="false"/>
               <w:widowControl w:val="false"/>
-              <w:pBdr/>
               <w:shd w:val="clear" w:fill="auto"/>
               <w:spacing w:lineRule="auto" w:line="240" w:before="0" w:after="0"/>
               <w:ind w:hanging="0" w:left="0" w:right="0"/>
@@ -9223,7 +8818,6 @@
               <w:keepNext w:val="false"/>
               <w:keepLines w:val="false"/>
               <w:widowControl w:val="false"/>
-              <w:pBdr/>
               <w:shd w:val="clear" w:fill="auto"/>
               <w:spacing w:lineRule="auto" w:line="240" w:before="0" w:after="0"/>
               <w:ind w:hanging="0" w:left="0" w:right="0"/>
@@ -9245,7 +8839,6 @@
               <w:keepNext w:val="false"/>
               <w:keepLines w:val="false"/>
               <w:widowControl w:val="false"/>
-              <w:pBdr/>
               <w:shd w:val="clear" w:fill="auto"/>
               <w:spacing w:lineRule="auto" w:line="240" w:before="0" w:after="0"/>
               <w:ind w:hanging="0" w:left="0" w:right="0"/>
@@ -9267,7 +8860,6 @@
               <w:keepNext w:val="false"/>
               <w:keepLines w:val="false"/>
               <w:widowControl w:val="false"/>
-              <w:pBdr/>
               <w:shd w:val="clear" w:fill="auto"/>
               <w:spacing w:lineRule="auto" w:line="240" w:before="0" w:after="0"/>
               <w:ind w:hanging="0" w:left="0" w:right="0"/>
@@ -9289,7 +8881,6 @@
               <w:keepNext w:val="false"/>
               <w:keepLines w:val="false"/>
               <w:widowControl w:val="false"/>
-              <w:pBdr/>
               <w:shd w:val="clear" w:fill="auto"/>
               <w:spacing w:lineRule="auto" w:line="240" w:before="0" w:after="0"/>
               <w:ind w:hanging="0" w:left="0" w:right="0"/>
@@ -9311,7 +8902,6 @@
               <w:keepNext w:val="false"/>
               <w:keepLines w:val="false"/>
               <w:widowControl w:val="false"/>
-              <w:pBdr/>
               <w:shd w:val="clear" w:fill="auto"/>
               <w:spacing w:lineRule="auto" w:line="240" w:before="0" w:after="0"/>
               <w:ind w:hanging="0" w:left="0" w:right="0"/>
@@ -9333,7 +8923,6 @@
               <w:keepNext w:val="false"/>
               <w:keepLines w:val="false"/>
               <w:widowControl w:val="false"/>
-              <w:pBdr/>
               <w:shd w:val="clear" w:fill="auto"/>
               <w:spacing w:lineRule="auto" w:line="240" w:before="0" w:after="0"/>
               <w:ind w:hanging="0" w:left="0" w:right="0"/>
@@ -9365,7 +8954,6 @@
               <w:keepNext w:val="false"/>
               <w:keepLines w:val="false"/>
               <w:widowControl w:val="false"/>
-              <w:pBdr/>
               <w:shd w:val="clear" w:fill="auto"/>
               <w:spacing w:lineRule="auto" w:line="240" w:before="0" w:after="0"/>
               <w:ind w:hanging="0" w:left="0" w:right="0"/>
@@ -9397,7 +8985,6 @@
               <w:keepNext w:val="false"/>
               <w:keepLines w:val="false"/>
               <w:widowControl w:val="false"/>
-              <w:pBdr/>
               <w:shd w:val="clear" w:fill="auto"/>
               <w:spacing w:lineRule="auto" w:line="240" w:before="0" w:after="0"/>
               <w:ind w:hanging="0" w:left="0" w:right="0"/>
@@ -9419,7 +9006,6 @@
               <w:keepNext w:val="false"/>
               <w:keepLines w:val="false"/>
               <w:widowControl w:val="false"/>
-              <w:pBdr/>
               <w:shd w:val="clear" w:fill="auto"/>
               <w:spacing w:lineRule="auto" w:line="240" w:before="0" w:after="0"/>
               <w:ind w:hanging="0" w:left="0" w:right="0"/>
@@ -9441,7 +9027,6 @@
               <w:keepNext w:val="false"/>
               <w:keepLines w:val="false"/>
               <w:widowControl w:val="false"/>
-              <w:pBdr/>
               <w:shd w:val="clear" w:fill="auto"/>
               <w:spacing w:lineRule="auto" w:line="240" w:before="0" w:after="0"/>
               <w:ind w:hanging="0" w:left="0" w:right="0"/>
@@ -9463,7 +9048,6 @@
               <w:keepNext w:val="false"/>
               <w:keepLines w:val="false"/>
               <w:widowControl w:val="false"/>
-              <w:pBdr/>
               <w:shd w:val="clear" w:fill="auto"/>
               <w:spacing w:lineRule="auto" w:line="240" w:before="0" w:after="0"/>
               <w:ind w:hanging="0" w:left="0" w:right="0"/>
@@ -9485,7 +9069,6 @@
               <w:keepNext w:val="false"/>
               <w:keepLines w:val="false"/>
               <w:widowControl w:val="false"/>
-              <w:pBdr/>
               <w:shd w:val="clear" w:fill="auto"/>
               <w:spacing w:lineRule="auto" w:line="240" w:before="0" w:after="0"/>
               <w:ind w:hanging="0" w:left="0" w:right="0"/>
@@ -9507,7 +9090,6 @@
               <w:keepNext w:val="false"/>
               <w:keepLines w:val="false"/>
               <w:widowControl w:val="false"/>
-              <w:pBdr/>
               <w:shd w:val="clear" w:fill="auto"/>
               <w:spacing w:lineRule="auto" w:line="240" w:before="0" w:after="0"/>
               <w:ind w:hanging="0" w:left="0" w:right="0"/>
@@ -9529,7 +9111,6 @@
               <w:keepNext w:val="false"/>
               <w:keepLines w:val="false"/>
               <w:widowControl w:val="false"/>
-              <w:pBdr/>
               <w:shd w:val="clear" w:fill="auto"/>
               <w:spacing w:lineRule="auto" w:line="240" w:before="0" w:after="0"/>
               <w:ind w:hanging="0" w:left="0" w:right="0"/>
@@ -9551,7 +9132,6 @@
               <w:keepNext w:val="false"/>
               <w:keepLines w:val="false"/>
               <w:widowControl w:val="false"/>
-              <w:pBdr/>
               <w:shd w:val="clear" w:fill="auto"/>
               <w:spacing w:lineRule="auto" w:line="240" w:before="0" w:after="0"/>
               <w:ind w:hanging="0" w:left="0" w:right="0"/>
@@ -9675,7 +9255,6 @@
               <w:keepNext w:val="false"/>
               <w:keepLines w:val="false"/>
               <w:widowControl w:val="false"/>
-              <w:pBdr/>
               <w:shd w:val="clear" w:fill="auto"/>
               <w:spacing w:lineRule="auto" w:line="240" w:before="0" w:after="0"/>
               <w:ind w:hanging="0" w:left="0" w:right="0"/>
@@ -9693,7 +9272,6 @@
               <w:keepNext w:val="false"/>
               <w:keepLines w:val="false"/>
               <w:widowControl w:val="false"/>
-              <w:pBdr/>
               <w:shd w:val="clear" w:fill="auto"/>
               <w:spacing w:lineRule="auto" w:line="240" w:before="0" w:after="0"/>
               <w:ind w:hanging="0" w:left="0" w:right="0"/>
@@ -9715,7 +9293,6 @@
               <w:keepNext w:val="false"/>
               <w:keepLines w:val="false"/>
               <w:widowControl w:val="false"/>
-              <w:pBdr/>
               <w:shd w:val="clear" w:fill="auto"/>
               <w:spacing w:lineRule="auto" w:line="240" w:before="0" w:after="0"/>
               <w:ind w:hanging="0" w:left="0" w:right="0"/>
@@ -9737,7 +9314,6 @@
               <w:keepNext w:val="false"/>
               <w:keepLines w:val="false"/>
               <w:widowControl w:val="false"/>
-              <w:pBdr/>
               <w:shd w:val="clear" w:fill="auto"/>
               <w:spacing w:lineRule="auto" w:line="240" w:before="0" w:after="0"/>
               <w:ind w:hanging="0" w:left="0" w:right="0"/>
@@ -9824,7 +9400,6 @@
               <w:keepNext w:val="false"/>
               <w:keepLines w:val="false"/>
               <w:widowControl w:val="false"/>
-              <w:pBdr/>
               <w:shd w:val="clear" w:fill="auto"/>
               <w:spacing w:lineRule="auto" w:line="240" w:before="0" w:after="0"/>
               <w:ind w:hanging="0" w:left="0" w:right="0"/>
@@ -9842,7 +9417,6 @@
               <w:keepNext w:val="false"/>
               <w:keepLines w:val="false"/>
               <w:widowControl w:val="false"/>
-              <w:pBdr/>
               <w:shd w:val="clear" w:fill="auto"/>
               <w:spacing w:lineRule="auto" w:line="240" w:before="0" w:after="0"/>
               <w:ind w:hanging="0" w:left="0" w:right="0"/>
@@ -9864,7 +9438,6 @@
               <w:keepNext w:val="false"/>
               <w:keepLines w:val="false"/>
               <w:widowControl w:val="false"/>
-              <w:pBdr/>
               <w:shd w:val="clear" w:fill="auto"/>
               <w:spacing w:lineRule="auto" w:line="240" w:before="0" w:after="0"/>
               <w:ind w:hanging="0" w:left="0" w:right="0"/>
@@ -9886,7 +9459,6 @@
               <w:keepNext w:val="false"/>
               <w:keepLines w:val="false"/>
               <w:widowControl w:val="false"/>
-              <w:pBdr/>
               <w:shd w:val="clear" w:fill="auto"/>
               <w:spacing w:lineRule="auto" w:line="240" w:before="0" w:after="0"/>
               <w:ind w:hanging="0" w:left="0" w:right="0"/>
@@ -9908,7 +9480,6 @@
               <w:keepNext w:val="false"/>
               <w:keepLines w:val="false"/>
               <w:widowControl w:val="false"/>
-              <w:pBdr/>
               <w:shd w:val="clear" w:fill="auto"/>
               <w:spacing w:lineRule="auto" w:line="240" w:before="0" w:after="0"/>
               <w:ind w:hanging="0" w:left="0" w:right="0"/>
@@ -9940,11 +9511,7 @@
       </w:pPr>
       <w:r>
         <w:rPr/>
-        <w:t>5</w:t>
-      </w:r>
-      <w:r>
-        <w:rPr/>
-        <w:t xml:space="preserve">) POST : </w:t>
+        <w:t xml:space="preserve">5) POST : </w:t>
       </w:r>
       <w:r>
         <w:rPr>
@@ -10049,11 +9616,7 @@
             </w:r>
             <w:r>
               <w:rPr/>
-              <w:t>"id": &lt;</w:t>
-            </w:r>
-            <w:r>
-              <w:rPr/>
-              <w:t>comment_id&gt;</w:t>
+              <w:t>"id": &lt;comment_id&gt;</w:t>
             </w:r>
           </w:p>
           <w:p>
@@ -10137,15 +9700,7 @@
             </w:r>
             <w:r>
               <w:rPr/>
-              <w:t>"content": "</w:t>
-            </w:r>
-            <w:r>
-              <w:rPr/>
-              <w:t>great!</w:t>
-            </w:r>
-            <w:r>
-              <w:rPr/>
-              <w:t>",</w:t>
+              <w:t>"content": "great!",</w:t>
             </w:r>
           </w:p>
           <w:p>
@@ -10159,15 +9714,7 @@
             </w:r>
             <w:r>
               <w:rPr/>
-              <w:t>"id": &lt;</w:t>
-            </w:r>
-            <w:r>
-              <w:rPr/>
-              <w:t>comment_id&gt;</w:t>
-            </w:r>
-            <w:r>
-              <w:rPr/>
-              <w:t>,</w:t>
+              <w:t>"id": &lt;comment_id&gt;,</w:t>
             </w:r>
           </w:p>
           <w:p>
@@ -10272,10 +9819,10 @@
         <w:rPr/>
         <w:t xml:space="preserve">URL - </w:t>
       </w:r>
-      <w:hyperlink r:id="rId5">
+      <w:hyperlink r:id="rId4">
         <w:r>
           <w:rPr>
-            <w:rStyle w:val="ListLabel82"/>
+            <w:rStyle w:val="ListLabel91"/>
             <w:color w:val="1155CC"/>
             <w:u w:val="single"/>
           </w:rPr>
@@ -10372,7 +9919,6 @@
               <w:keepNext w:val="false"/>
               <w:keepLines w:val="false"/>
               <w:widowControl w:val="false"/>
-              <w:pBdr/>
               <w:shd w:val="clear" w:fill="auto"/>
               <w:spacing w:lineRule="auto" w:line="240" w:before="0" w:after="0"/>
               <w:ind w:hanging="0" w:left="0" w:right="0"/>
@@ -10390,7 +9936,6 @@
               <w:keepNext w:val="false"/>
               <w:keepLines w:val="false"/>
               <w:widowControl w:val="false"/>
-              <w:pBdr/>
               <w:shd w:val="clear" w:fill="auto"/>
               <w:spacing w:lineRule="auto" w:line="240" w:before="0" w:after="0"/>
               <w:ind w:hanging="0" w:left="0" w:right="0"/>
@@ -10408,7 +9953,6 @@
               <w:keepNext w:val="false"/>
               <w:keepLines w:val="false"/>
               <w:widowControl w:val="false"/>
-              <w:pBdr/>
               <w:shd w:val="clear" w:fill="auto"/>
               <w:spacing w:lineRule="auto" w:line="240" w:before="0" w:after="0"/>
               <w:ind w:hanging="0" w:left="0" w:right="0"/>
@@ -10426,7 +9970,6 @@
               <w:keepNext w:val="false"/>
               <w:keepLines w:val="false"/>
               <w:widowControl w:val="false"/>
-              <w:pBdr/>
               <w:shd w:val="clear" w:fill="auto"/>
               <w:spacing w:lineRule="auto" w:line="240" w:before="0" w:after="0"/>
               <w:ind w:hanging="0" w:left="0" w:right="0"/>
@@ -10506,7 +10049,6 @@
               <w:keepNext w:val="false"/>
               <w:keepLines w:val="false"/>
               <w:widowControl w:val="false"/>
-              <w:pBdr/>
               <w:shd w:val="clear" w:fill="auto"/>
               <w:spacing w:lineRule="auto" w:line="240" w:before="0" w:after="0"/>
               <w:ind w:hanging="0" w:left="0" w:right="0"/>
@@ -10524,7 +10066,6 @@
               <w:keepNext w:val="false"/>
               <w:keepLines w:val="false"/>
               <w:widowControl w:val="false"/>
-              <w:pBdr/>
               <w:shd w:val="clear" w:fill="auto"/>
               <w:spacing w:lineRule="auto" w:line="240" w:before="0" w:after="0"/>
               <w:ind w:hanging="0" w:left="0" w:right="0"/>
@@ -10546,7 +10087,6 @@
               <w:keepNext w:val="false"/>
               <w:keepLines w:val="false"/>
               <w:widowControl w:val="false"/>
-              <w:pBdr/>
               <w:shd w:val="clear" w:fill="auto"/>
               <w:spacing w:lineRule="auto" w:line="240" w:before="0" w:after="0"/>
               <w:ind w:hanging="0" w:left="0" w:right="0"/>
@@ -10568,7 +10108,6 @@
               <w:keepNext w:val="false"/>
               <w:keepLines w:val="false"/>
               <w:widowControl w:val="false"/>
-              <w:pBdr/>
               <w:shd w:val="clear" w:fill="auto"/>
               <w:spacing w:lineRule="auto" w:line="240" w:before="0" w:after="0"/>
               <w:ind w:hanging="0" w:left="0" w:right="0"/>
@@ -10590,7 +10129,6 @@
               <w:keepNext w:val="false"/>
               <w:keepLines w:val="false"/>
               <w:widowControl w:val="false"/>
-              <w:pBdr/>
               <w:shd w:val="clear" w:fill="auto"/>
               <w:spacing w:lineRule="auto" w:line="240" w:before="0" w:after="0"/>
               <w:ind w:hanging="0" w:left="0" w:right="0"/>
@@ -10612,7 +10150,6 @@
               <w:keepNext w:val="false"/>
               <w:keepLines w:val="false"/>
               <w:widowControl w:val="false"/>
-              <w:pBdr/>
               <w:shd w:val="clear" w:fill="auto"/>
               <w:spacing w:lineRule="auto" w:line="240" w:before="0" w:after="0"/>
               <w:ind w:hanging="0" w:left="0" w:right="0"/>
@@ -10634,7 +10171,6 @@
               <w:keepNext w:val="false"/>
               <w:keepLines w:val="false"/>
               <w:widowControl w:val="false"/>
-              <w:pBdr/>
               <w:shd w:val="clear" w:fill="auto"/>
               <w:spacing w:lineRule="auto" w:line="240" w:before="0" w:after="0"/>
               <w:ind w:hanging="0" w:left="0" w:right="0"/>
@@ -10656,7 +10192,6 @@
               <w:keepNext w:val="false"/>
               <w:keepLines w:val="false"/>
               <w:widowControl w:val="false"/>
-              <w:pBdr/>
               <w:shd w:val="clear" w:fill="auto"/>
               <w:spacing w:lineRule="auto" w:line="240" w:before="0" w:after="0"/>
               <w:ind w:hanging="0" w:left="0" w:right="0"/>
@@ -10678,7 +10213,6 @@
               <w:keepNext w:val="false"/>
               <w:keepLines w:val="false"/>
               <w:widowControl w:val="false"/>
-              <w:pBdr/>
               <w:shd w:val="clear" w:fill="auto"/>
               <w:spacing w:lineRule="auto" w:line="240" w:before="0" w:after="0"/>
               <w:ind w:hanging="0" w:left="0" w:right="0"/>
@@ -10775,7 +10309,6 @@
               <w:keepNext w:val="false"/>
               <w:keepLines w:val="false"/>
               <w:widowControl w:val="false"/>
-              <w:pBdr/>
               <w:shd w:val="clear" w:fill="auto"/>
               <w:spacing w:lineRule="auto" w:line="240" w:before="0" w:after="0"/>
               <w:ind w:hanging="0" w:left="0" w:right="0"/>
@@ -10793,7 +10326,6 @@
               <w:keepNext w:val="false"/>
               <w:keepLines w:val="false"/>
               <w:widowControl w:val="false"/>
-              <w:pBdr/>
               <w:shd w:val="clear" w:fill="auto"/>
               <w:spacing w:lineRule="auto" w:line="240" w:before="0" w:after="0"/>
               <w:ind w:hanging="0" w:left="0" w:right="0"/>
@@ -10811,7 +10343,6 @@
               <w:keepNext w:val="false"/>
               <w:keepLines w:val="false"/>
               <w:widowControl w:val="false"/>
-              <w:pBdr/>
               <w:shd w:val="clear" w:fill="auto"/>
               <w:spacing w:lineRule="auto" w:line="240" w:before="0" w:after="0"/>
               <w:ind w:hanging="0" w:left="0" w:right="0"/>
@@ -10829,7 +10360,6 @@
               <w:keepNext w:val="false"/>
               <w:keepLines w:val="false"/>
               <w:widowControl w:val="false"/>
-              <w:pBdr/>
               <w:shd w:val="clear" w:fill="auto"/>
               <w:spacing w:lineRule="auto" w:line="240" w:before="0" w:after="0"/>
               <w:ind w:hanging="0" w:left="0" w:right="0"/>
@@ -10912,7 +10442,6 @@
               <w:keepNext w:val="false"/>
               <w:keepLines w:val="false"/>
               <w:widowControl w:val="false"/>
-              <w:pBdr/>
               <w:shd w:val="clear" w:fill="auto"/>
               <w:spacing w:lineRule="auto" w:line="240" w:before="0" w:after="0"/>
               <w:ind w:hanging="0" w:left="0" w:right="0"/>
@@ -10930,7 +10459,6 @@
               <w:keepNext w:val="false"/>
               <w:keepLines w:val="false"/>
               <w:widowControl w:val="false"/>
-              <w:pBdr/>
               <w:shd w:val="clear" w:fill="auto"/>
               <w:spacing w:lineRule="auto" w:line="240" w:before="0" w:after="0"/>
               <w:ind w:hanging="0" w:left="0" w:right="0"/>
@@ -10952,7 +10480,6 @@
               <w:keepNext w:val="false"/>
               <w:keepLines w:val="false"/>
               <w:widowControl w:val="false"/>
-              <w:pBdr/>
               <w:shd w:val="clear" w:fill="auto"/>
               <w:spacing w:lineRule="auto" w:line="240" w:before="0" w:after="0"/>
               <w:ind w:hanging="0" w:left="0" w:right="0"/>
@@ -10974,7 +10501,6 @@
               <w:keepNext w:val="false"/>
               <w:keepLines w:val="false"/>
               <w:widowControl w:val="false"/>
-              <w:pBdr/>
               <w:shd w:val="clear" w:fill="auto"/>
               <w:spacing w:lineRule="auto" w:line="240" w:before="0" w:after="0"/>
               <w:ind w:hanging="0" w:left="0" w:right="0"/>
@@ -10996,7 +10522,6 @@
               <w:keepNext w:val="false"/>
               <w:keepLines w:val="false"/>
               <w:widowControl w:val="false"/>
-              <w:pBdr/>
               <w:shd w:val="clear" w:fill="auto"/>
               <w:spacing w:lineRule="auto" w:line="240" w:before="0" w:after="0"/>
               <w:ind w:hanging="0" w:left="0" w:right="0"/>
@@ -11018,7 +10543,6 @@
               <w:keepNext w:val="false"/>
               <w:keepLines w:val="false"/>
               <w:widowControl w:val="false"/>
-              <w:pBdr/>
               <w:shd w:val="clear" w:fill="auto"/>
               <w:spacing w:lineRule="auto" w:line="240" w:before="0" w:after="0"/>
               <w:ind w:hanging="0" w:left="0" w:right="0"/>
@@ -11040,7 +10564,6 @@
               <w:keepNext w:val="false"/>
               <w:keepLines w:val="false"/>
               <w:widowControl w:val="false"/>
-              <w:pBdr/>
               <w:shd w:val="clear" w:fill="auto"/>
               <w:spacing w:lineRule="auto" w:line="240" w:before="0" w:after="0"/>
               <w:ind w:hanging="0" w:left="0" w:right="0"/>
@@ -11062,7 +10585,6 @@
               <w:keepNext w:val="false"/>
               <w:keepLines w:val="false"/>
               <w:widowControl w:val="false"/>
-              <w:pBdr/>
               <w:shd w:val="clear" w:fill="auto"/>
               <w:spacing w:lineRule="auto" w:line="240" w:before="0" w:after="0"/>
               <w:ind w:hanging="0" w:left="0" w:right="0"/>
@@ -11084,7 +10606,6 @@
               <w:keepNext w:val="false"/>
               <w:keepLines w:val="false"/>
               <w:widowControl w:val="false"/>
-              <w:pBdr/>
               <w:shd w:val="clear" w:fill="auto"/>
               <w:spacing w:lineRule="auto" w:line="240" w:before="0" w:after="0"/>
               <w:ind w:hanging="0" w:left="0" w:right="0"/>
@@ -11106,7 +10627,6 @@
               <w:keepNext w:val="false"/>
               <w:keepLines w:val="false"/>
               <w:widowControl w:val="false"/>
-              <w:pBdr/>
               <w:shd w:val="clear" w:fill="auto"/>
               <w:spacing w:lineRule="auto" w:line="240" w:before="0" w:after="0"/>
               <w:ind w:hanging="0" w:left="0" w:right="0"/>
@@ -11204,7 +10724,6 @@
               <w:keepNext w:val="false"/>
               <w:keepLines w:val="false"/>
               <w:widowControl w:val="false"/>
-              <w:pBdr/>
               <w:shd w:val="clear" w:fill="auto"/>
               <w:spacing w:lineRule="auto" w:line="240" w:before="0" w:after="0"/>
               <w:ind w:hanging="0" w:left="0" w:right="0"/>
@@ -11222,7 +10741,6 @@
               <w:keepNext w:val="false"/>
               <w:keepLines w:val="false"/>
               <w:widowControl w:val="false"/>
-              <w:pBdr/>
               <w:shd w:val="clear" w:fill="auto"/>
               <w:spacing w:lineRule="auto" w:line="240" w:before="0" w:after="0"/>
               <w:ind w:hanging="0" w:left="0" w:right="0"/>
@@ -11240,7 +10758,6 @@
               <w:keepNext w:val="false"/>
               <w:keepLines w:val="false"/>
               <w:widowControl w:val="false"/>
-              <w:pBdr/>
               <w:shd w:val="clear" w:fill="auto"/>
               <w:spacing w:lineRule="auto" w:line="240" w:before="0" w:after="0"/>
               <w:ind w:hanging="0" w:left="0" w:right="0"/>
@@ -11258,7 +10775,6 @@
               <w:keepNext w:val="false"/>
               <w:keepLines w:val="false"/>
               <w:widowControl w:val="false"/>
-              <w:pBdr/>
               <w:shd w:val="clear" w:fill="auto"/>
               <w:spacing w:lineRule="auto" w:line="240" w:before="0" w:after="0"/>
               <w:ind w:hanging="0" w:left="0" w:right="0"/>
@@ -11341,7 +10857,6 @@
               <w:keepNext w:val="false"/>
               <w:keepLines w:val="false"/>
               <w:widowControl w:val="false"/>
-              <w:pBdr/>
               <w:shd w:val="clear" w:fill="auto"/>
               <w:spacing w:lineRule="auto" w:line="240" w:before="0" w:after="0"/>
               <w:ind w:hanging="0" w:left="0" w:right="0"/>
@@ -11359,7 +10874,6 @@
               <w:keepNext w:val="false"/>
               <w:keepLines w:val="false"/>
               <w:widowControl w:val="false"/>
-              <w:pBdr/>
               <w:shd w:val="clear" w:fill="auto"/>
               <w:spacing w:lineRule="auto" w:line="240" w:before="0" w:after="0"/>
               <w:ind w:hanging="0" w:left="0" w:right="0"/>
@@ -11381,7 +10895,6 @@
               <w:keepNext w:val="false"/>
               <w:keepLines w:val="false"/>
               <w:widowControl w:val="false"/>
-              <w:pBdr/>
               <w:shd w:val="clear" w:fill="auto"/>
               <w:spacing w:lineRule="auto" w:line="240" w:before="0" w:after="0"/>
               <w:ind w:hanging="0" w:left="0" w:right="0"/>
@@ -11403,7 +10916,6 @@
               <w:keepNext w:val="false"/>
               <w:keepLines w:val="false"/>
               <w:widowControl w:val="false"/>
-              <w:pBdr/>
               <w:shd w:val="clear" w:fill="auto"/>
               <w:spacing w:lineRule="auto" w:line="240" w:before="0" w:after="0"/>
               <w:ind w:hanging="0" w:left="0" w:right="0"/>
@@ -11425,7 +10937,6 @@
               <w:keepNext w:val="false"/>
               <w:keepLines w:val="false"/>
               <w:widowControl w:val="false"/>
-              <w:pBdr/>
               <w:shd w:val="clear" w:fill="auto"/>
               <w:spacing w:lineRule="auto" w:line="240" w:before="0" w:after="0"/>
               <w:ind w:hanging="0" w:left="0" w:right="0"/>
@@ -11447,7 +10958,6 @@
               <w:keepNext w:val="false"/>
               <w:keepLines w:val="false"/>
               <w:widowControl w:val="false"/>
-              <w:pBdr/>
               <w:shd w:val="clear" w:fill="auto"/>
               <w:spacing w:lineRule="auto" w:line="240" w:before="0" w:after="0"/>
               <w:ind w:hanging="0" w:left="0" w:right="0"/>
@@ -11469,7 +10979,6 @@
               <w:keepNext w:val="false"/>
               <w:keepLines w:val="false"/>
               <w:widowControl w:val="false"/>
-              <w:pBdr/>
               <w:shd w:val="clear" w:fill="auto"/>
               <w:spacing w:lineRule="auto" w:line="240" w:before="0" w:after="0"/>
               <w:ind w:hanging="0" w:left="0" w:right="0"/>
@@ -11491,7 +11000,6 @@
               <w:keepNext w:val="false"/>
               <w:keepLines w:val="false"/>
               <w:widowControl w:val="false"/>
-              <w:pBdr/>
               <w:shd w:val="clear" w:fill="auto"/>
               <w:spacing w:lineRule="auto" w:line="240" w:before="0" w:after="0"/>
               <w:ind w:hanging="0" w:left="0" w:right="0"/>
@@ -11513,7 +11021,6 @@
               <w:keepNext w:val="false"/>
               <w:keepLines w:val="false"/>
               <w:widowControl w:val="false"/>
-              <w:pBdr/>
               <w:shd w:val="clear" w:fill="auto"/>
               <w:spacing w:lineRule="auto" w:line="240" w:before="0" w:after="0"/>
               <w:ind w:hanging="0" w:left="0" w:right="0"/>
@@ -11535,7 +11042,6 @@
               <w:keepNext w:val="false"/>
               <w:keepLines w:val="false"/>
               <w:widowControl w:val="false"/>
-              <w:pBdr/>
               <w:shd w:val="clear" w:fill="auto"/>
               <w:spacing w:lineRule="auto" w:line="240" w:before="0" w:after="0"/>
               <w:ind w:hanging="0" w:left="0" w:right="0"/>
@@ -11557,7 +11063,6 @@
               <w:keepNext w:val="false"/>
               <w:keepLines w:val="false"/>
               <w:widowControl w:val="false"/>
-              <w:pBdr/>
               <w:shd w:val="clear" w:fill="auto"/>
               <w:spacing w:lineRule="auto" w:line="240" w:before="0" w:after="0"/>
               <w:ind w:hanging="0" w:left="0" w:right="0"/>
@@ -11579,7 +11084,6 @@
               <w:keepNext w:val="false"/>
               <w:keepLines w:val="false"/>
               <w:widowControl w:val="false"/>
-              <w:pBdr/>
               <w:shd w:val="clear" w:fill="auto"/>
               <w:spacing w:lineRule="auto" w:line="240" w:before="0" w:after="0"/>
               <w:ind w:hanging="0" w:left="0" w:right="0"/>
@@ -11677,7 +11181,6 @@
               <w:keepNext w:val="false"/>
               <w:keepLines w:val="false"/>
               <w:widowControl w:val="false"/>
-              <w:pBdr/>
               <w:shd w:val="clear" w:fill="auto"/>
               <w:spacing w:lineRule="auto" w:line="240" w:before="0" w:after="0"/>
               <w:ind w:hanging="0" w:left="0" w:right="0"/>
@@ -11695,7 +11198,6 @@
               <w:keepNext w:val="false"/>
               <w:keepLines w:val="false"/>
               <w:widowControl w:val="false"/>
-              <w:pBdr/>
               <w:shd w:val="clear" w:fill="auto"/>
               <w:spacing w:lineRule="auto" w:line="240" w:before="0" w:after="0"/>
               <w:ind w:hanging="0" w:left="0" w:right="0"/>
@@ -11713,7 +11215,6 @@
               <w:keepNext w:val="false"/>
               <w:keepLines w:val="false"/>
               <w:widowControl w:val="false"/>
-              <w:pBdr/>
               <w:shd w:val="clear" w:fill="auto"/>
               <w:spacing w:lineRule="auto" w:line="240" w:before="0" w:after="0"/>
               <w:ind w:hanging="0" w:left="0" w:right="0"/>
@@ -11731,7 +11232,6 @@
               <w:keepNext w:val="false"/>
               <w:keepLines w:val="false"/>
               <w:widowControl w:val="false"/>
-              <w:pBdr/>
               <w:shd w:val="clear" w:fill="auto"/>
               <w:spacing w:lineRule="auto" w:line="240" w:before="0" w:after="0"/>
               <w:ind w:hanging="0" w:left="0" w:right="0"/>
@@ -11854,7 +11354,6 @@
               <w:keepNext w:val="false"/>
               <w:keepLines w:val="false"/>
               <w:widowControl w:val="false"/>
-              <w:pBdr/>
               <w:shd w:val="clear" w:fill="auto"/>
               <w:spacing w:lineRule="auto" w:line="240" w:before="0" w:after="0"/>
               <w:ind w:hanging="0" w:left="0" w:right="0"/>
@@ -11872,7 +11371,6 @@
               <w:keepNext w:val="false"/>
               <w:keepLines w:val="false"/>
               <w:widowControl w:val="false"/>
-              <w:pBdr/>
               <w:shd w:val="clear" w:fill="auto"/>
               <w:spacing w:lineRule="auto" w:line="240" w:before="0" w:after="0"/>
               <w:ind w:hanging="0" w:left="0" w:right="0"/>
@@ -11894,7 +11392,6 @@
               <w:keepNext w:val="false"/>
               <w:keepLines w:val="false"/>
               <w:widowControl w:val="false"/>
-              <w:pBdr/>
               <w:shd w:val="clear" w:fill="auto"/>
               <w:spacing w:lineRule="auto" w:line="240" w:before="0" w:after="0"/>
               <w:ind w:hanging="0" w:left="0" w:right="0"/>
@@ -11916,7 +11413,6 @@
               <w:keepNext w:val="false"/>
               <w:keepLines w:val="false"/>
               <w:widowControl w:val="false"/>
-              <w:pBdr/>
               <w:shd w:val="clear" w:fill="auto"/>
               <w:spacing w:lineRule="auto" w:line="240" w:before="0" w:after="0"/>
               <w:ind w:hanging="0" w:left="0" w:right="0"/>
@@ -11938,7 +11434,6 @@
               <w:keepNext w:val="false"/>
               <w:keepLines w:val="false"/>
               <w:widowControl w:val="false"/>
-              <w:pBdr/>
               <w:shd w:val="clear" w:fill="auto"/>
               <w:spacing w:lineRule="auto" w:line="240" w:before="0" w:after="0"/>
               <w:ind w:hanging="0" w:left="0" w:right="0"/>
@@ -11960,7 +11455,6 @@
               <w:keepNext w:val="false"/>
               <w:keepLines w:val="false"/>
               <w:widowControl w:val="false"/>
-              <w:pBdr/>
               <w:shd w:val="clear" w:fill="auto"/>
               <w:spacing w:lineRule="auto" w:line="240" w:before="0" w:after="0"/>
               <w:ind w:hanging="0" w:left="0" w:right="0"/>
@@ -11982,7 +11476,6 @@
               <w:keepNext w:val="false"/>
               <w:keepLines w:val="false"/>
               <w:widowControl w:val="false"/>
-              <w:pBdr/>
               <w:shd w:val="clear" w:fill="auto"/>
               <w:spacing w:lineRule="auto" w:line="240" w:before="0" w:after="0"/>
               <w:ind w:hanging="0" w:left="0" w:right="0"/>
@@ -12004,7 +11497,6 @@
               <w:keepNext w:val="false"/>
               <w:keepLines w:val="false"/>
               <w:widowControl w:val="false"/>
-              <w:pBdr/>
               <w:shd w:val="clear" w:fill="auto"/>
               <w:spacing w:lineRule="auto" w:line="240" w:before="0" w:after="0"/>
               <w:ind w:hanging="0" w:left="0" w:right="0"/>
@@ -12026,7 +11518,6 @@
               <w:keepNext w:val="false"/>
               <w:keepLines w:val="false"/>
               <w:widowControl w:val="false"/>
-              <w:pBdr/>
               <w:shd w:val="clear" w:fill="auto"/>
               <w:spacing w:lineRule="auto" w:line="240" w:before="0" w:after="0"/>
               <w:ind w:hanging="0" w:left="0" w:right="0"/>
@@ -12048,7 +11539,6 @@
               <w:keepNext w:val="false"/>
               <w:keepLines w:val="false"/>
               <w:widowControl w:val="false"/>
-              <w:pBdr/>
               <w:shd w:val="clear" w:fill="auto"/>
               <w:spacing w:lineRule="auto" w:line="240" w:before="0" w:after="0"/>
               <w:ind w:hanging="0" w:left="0" w:right="0"/>
@@ -12156,7 +11646,6 @@
               <w:keepNext w:val="false"/>
               <w:keepLines w:val="false"/>
               <w:widowControl w:val="false"/>
-              <w:pBdr/>
               <w:shd w:val="clear" w:fill="auto"/>
               <w:spacing w:lineRule="auto" w:line="240" w:before="0" w:after="0"/>
               <w:ind w:hanging="0" w:left="0" w:right="0"/>
@@ -12174,7 +11663,6 @@
               <w:keepNext w:val="false"/>
               <w:keepLines w:val="false"/>
               <w:widowControl w:val="false"/>
-              <w:pBdr/>
               <w:shd w:val="clear" w:fill="auto"/>
               <w:spacing w:lineRule="auto" w:line="240" w:before="0" w:after="0"/>
               <w:ind w:hanging="0" w:left="0" w:right="0"/>
@@ -12192,7 +11680,6 @@
               <w:keepNext w:val="false"/>
               <w:keepLines w:val="false"/>
               <w:widowControl w:val="false"/>
-              <w:pBdr/>
               <w:shd w:val="clear" w:fill="auto"/>
               <w:spacing w:lineRule="auto" w:line="240" w:before="0" w:after="0"/>
               <w:ind w:hanging="0" w:left="0" w:right="0"/>
@@ -12210,7 +11697,6 @@
               <w:keepNext w:val="false"/>
               <w:keepLines w:val="false"/>
               <w:widowControl w:val="false"/>
-              <w:pBdr/>
               <w:shd w:val="clear" w:fill="auto"/>
               <w:spacing w:lineRule="auto" w:line="240" w:before="0" w:after="0"/>
               <w:ind w:hanging="0" w:left="0" w:right="0"/>
@@ -12293,7 +11779,6 @@
               <w:keepNext w:val="false"/>
               <w:keepLines w:val="false"/>
               <w:widowControl w:val="false"/>
-              <w:pBdr/>
               <w:shd w:val="clear" w:fill="auto"/>
               <w:spacing w:lineRule="auto" w:line="240" w:before="0" w:after="0"/>
               <w:ind w:hanging="0" w:left="0" w:right="0"/>
@@ -12311,7 +11796,6 @@
               <w:keepNext w:val="false"/>
               <w:keepLines w:val="false"/>
               <w:widowControl w:val="false"/>
-              <w:pBdr/>
               <w:shd w:val="clear" w:fill="auto"/>
               <w:spacing w:lineRule="auto" w:line="240" w:before="0" w:after="0"/>
               <w:ind w:hanging="0" w:left="0" w:right="0"/>
@@ -12333,7 +11817,6 @@
               <w:keepNext w:val="false"/>
               <w:keepLines w:val="false"/>
               <w:widowControl w:val="false"/>
-              <w:pBdr/>
               <w:shd w:val="clear" w:fill="auto"/>
               <w:spacing w:lineRule="auto" w:line="240" w:before="0" w:after="0"/>
               <w:ind w:hanging="0" w:left="0" w:right="0"/>
@@ -12355,7 +11838,6 @@
               <w:keepNext w:val="false"/>
               <w:keepLines w:val="false"/>
               <w:widowControl w:val="false"/>
-              <w:pBdr/>
               <w:shd w:val="clear" w:fill="auto"/>
               <w:spacing w:lineRule="auto" w:line="240" w:before="0" w:after="0"/>
               <w:ind w:hanging="0" w:left="0" w:right="0"/>
@@ -12377,7 +11859,6 @@
               <w:keepNext w:val="false"/>
               <w:keepLines w:val="false"/>
               <w:widowControl w:val="false"/>
-              <w:pBdr/>
               <w:shd w:val="clear" w:fill="auto"/>
               <w:spacing w:lineRule="auto" w:line="240" w:before="0" w:after="0"/>
               <w:ind w:hanging="0" w:left="0" w:right="0"/>
@@ -12485,7 +11966,6 @@
               <w:keepNext w:val="false"/>
               <w:keepLines w:val="false"/>
               <w:widowControl w:val="false"/>
-              <w:pBdr/>
               <w:shd w:val="clear" w:fill="auto"/>
               <w:spacing w:lineRule="auto" w:line="240" w:before="0" w:after="0"/>
               <w:ind w:hanging="0" w:left="0" w:right="0"/>
@@ -12503,7 +11983,6 @@
               <w:keepNext w:val="false"/>
               <w:keepLines w:val="false"/>
               <w:widowControl w:val="false"/>
-              <w:pBdr/>
               <w:shd w:val="clear" w:fill="auto"/>
               <w:spacing w:lineRule="auto" w:line="240" w:before="0" w:after="0"/>
               <w:ind w:hanging="0" w:left="0" w:right="0"/>
@@ -12521,7 +12000,6 @@
               <w:keepNext w:val="false"/>
               <w:keepLines w:val="false"/>
               <w:widowControl w:val="false"/>
-              <w:pBdr/>
               <w:shd w:val="clear" w:fill="auto"/>
               <w:spacing w:lineRule="auto" w:line="240" w:before="0" w:after="0"/>
               <w:ind w:hanging="0" w:left="0" w:right="0"/>
@@ -12539,7 +12017,6 @@
               <w:keepNext w:val="false"/>
               <w:keepLines w:val="false"/>
               <w:widowControl w:val="false"/>
-              <w:pBdr/>
               <w:shd w:val="clear" w:fill="auto"/>
               <w:spacing w:lineRule="auto" w:line="240" w:before="0" w:after="0"/>
               <w:ind w:hanging="0" w:left="0" w:right="0"/>
@@ -12652,7 +12129,6 @@
               <w:keepNext w:val="false"/>
               <w:keepLines w:val="false"/>
               <w:widowControl w:val="false"/>
-              <w:pBdr/>
               <w:shd w:val="clear" w:fill="auto"/>
               <w:spacing w:lineRule="auto" w:line="240" w:before="0" w:after="0"/>
               <w:ind w:hanging="0" w:left="0" w:right="0"/>
@@ -12670,7 +12146,6 @@
               <w:keepNext w:val="false"/>
               <w:keepLines w:val="false"/>
               <w:widowControl w:val="false"/>
-              <w:pBdr/>
               <w:shd w:val="clear" w:fill="auto"/>
               <w:spacing w:lineRule="auto" w:line="240" w:before="0" w:after="0"/>
               <w:ind w:hanging="0" w:left="0" w:right="0"/>
@@ -12692,7 +12167,6 @@
               <w:keepNext w:val="false"/>
               <w:keepLines w:val="false"/>
               <w:widowControl w:val="false"/>
-              <w:pBdr/>
               <w:shd w:val="clear" w:fill="auto"/>
               <w:spacing w:lineRule="auto" w:line="240" w:before="0" w:after="0"/>
               <w:ind w:hanging="0" w:left="0" w:right="0"/>
@@ -12714,7 +12188,6 @@
               <w:keepNext w:val="false"/>
               <w:keepLines w:val="false"/>
               <w:widowControl w:val="false"/>
-              <w:pBdr/>
               <w:shd w:val="clear" w:fill="auto"/>
               <w:spacing w:lineRule="auto" w:line="240" w:before="0" w:after="0"/>
               <w:ind w:hanging="0" w:left="0" w:right="0"/>
@@ -12736,7 +12209,6 @@
               <w:keepNext w:val="false"/>
               <w:keepLines w:val="false"/>
               <w:widowControl w:val="false"/>
-              <w:pBdr/>
               <w:shd w:val="clear" w:fill="auto"/>
               <w:spacing w:lineRule="auto" w:line="240" w:before="0" w:after="0"/>
               <w:ind w:hanging="0" w:left="0" w:right="0"/>
@@ -12758,7 +12230,6 @@
               <w:keepNext w:val="false"/>
               <w:keepLines w:val="false"/>
               <w:widowControl w:val="false"/>
-              <w:pBdr/>
               <w:shd w:val="clear" w:fill="auto"/>
               <w:spacing w:lineRule="auto" w:line="240" w:before="0" w:after="0"/>
               <w:ind w:hanging="0" w:left="0" w:right="0"/>
@@ -12780,7 +12251,6 @@
               <w:keepNext w:val="false"/>
               <w:keepLines w:val="false"/>
               <w:widowControl w:val="false"/>
-              <w:pBdr/>
               <w:shd w:val="clear" w:fill="auto"/>
               <w:spacing w:lineRule="auto" w:line="240" w:before="0" w:after="0"/>
               <w:ind w:hanging="0" w:left="0" w:right="0"/>
@@ -12802,7 +12272,6 @@
               <w:keepNext w:val="false"/>
               <w:keepLines w:val="false"/>
               <w:widowControl w:val="false"/>
-              <w:pBdr/>
               <w:shd w:val="clear" w:fill="auto"/>
               <w:spacing w:lineRule="auto" w:line="240" w:before="0" w:after="0"/>
               <w:ind w:hanging="0" w:left="0" w:right="0"/>
@@ -12824,7 +12293,6 @@
               <w:keepNext w:val="false"/>
               <w:keepLines w:val="false"/>
               <w:widowControl w:val="false"/>
-              <w:pBdr/>
               <w:shd w:val="clear" w:fill="auto"/>
               <w:spacing w:lineRule="auto" w:line="240" w:before="0" w:after="0"/>
               <w:ind w:hanging="0" w:left="0" w:right="0"/>
@@ -12846,7 +12314,6 @@
               <w:keepNext w:val="false"/>
               <w:keepLines w:val="false"/>
               <w:widowControl w:val="false"/>
-              <w:pBdr/>
               <w:shd w:val="clear" w:fill="auto"/>
               <w:spacing w:lineRule="auto" w:line="240" w:before="0" w:after="0"/>
               <w:ind w:hanging="0" w:left="0" w:right="0"/>
@@ -12964,7 +12431,6 @@
               <w:keepNext w:val="false"/>
               <w:keepLines w:val="false"/>
               <w:widowControl w:val="false"/>
-              <w:pBdr/>
               <w:shd w:val="clear" w:fill="auto"/>
               <w:spacing w:lineRule="auto" w:line="240" w:before="0" w:after="0"/>
               <w:ind w:hanging="0" w:left="0" w:right="0"/>
@@ -12982,7 +12448,6 @@
               <w:keepNext w:val="false"/>
               <w:keepLines w:val="false"/>
               <w:widowControl w:val="false"/>
-              <w:pBdr/>
               <w:shd w:val="clear" w:fill="auto"/>
               <w:spacing w:lineRule="auto" w:line="240" w:before="0" w:after="0"/>
               <w:ind w:hanging="0" w:left="0" w:right="0"/>
@@ -13000,7 +12465,6 @@
               <w:keepNext w:val="false"/>
               <w:keepLines w:val="false"/>
               <w:widowControl w:val="false"/>
-              <w:pBdr/>
               <w:shd w:val="clear" w:fill="auto"/>
               <w:spacing w:lineRule="auto" w:line="240" w:before="0" w:after="0"/>
               <w:ind w:hanging="0" w:left="0" w:right="0"/>
@@ -13018,7 +12482,6 @@
               <w:keepNext w:val="false"/>
               <w:keepLines w:val="false"/>
               <w:widowControl w:val="false"/>
-              <w:pBdr/>
               <w:shd w:val="clear" w:fill="auto"/>
               <w:spacing w:lineRule="auto" w:line="240" w:before="0" w:after="0"/>
               <w:ind w:hanging="0" w:left="0" w:right="0"/>
@@ -13101,7 +12564,6 @@
               <w:keepNext w:val="false"/>
               <w:keepLines w:val="false"/>
               <w:widowControl w:val="false"/>
-              <w:pBdr/>
               <w:shd w:val="clear" w:fill="auto"/>
               <w:spacing w:lineRule="auto" w:line="240" w:before="0" w:after="0"/>
               <w:ind w:hanging="0" w:left="0" w:right="0"/>
@@ -13119,7 +12581,6 @@
               <w:keepNext w:val="false"/>
               <w:keepLines w:val="false"/>
               <w:widowControl w:val="false"/>
-              <w:pBdr/>
               <w:shd w:val="clear" w:fill="auto"/>
               <w:spacing w:lineRule="auto" w:line="240" w:before="0" w:after="0"/>
               <w:ind w:hanging="0" w:left="0" w:right="0"/>
@@ -13141,7 +12602,6 @@
               <w:keepNext w:val="false"/>
               <w:keepLines w:val="false"/>
               <w:widowControl w:val="false"/>
-              <w:pBdr/>
               <w:shd w:val="clear" w:fill="auto"/>
               <w:spacing w:lineRule="auto" w:line="240" w:before="0" w:after="0"/>
               <w:ind w:hanging="0" w:left="0" w:right="0"/>
@@ -13163,7 +12623,6 @@
               <w:keepNext w:val="false"/>
               <w:keepLines w:val="false"/>
               <w:widowControl w:val="false"/>
-              <w:pBdr/>
               <w:shd w:val="clear" w:fill="auto"/>
               <w:spacing w:lineRule="auto" w:line="240" w:before="0" w:after="0"/>
               <w:ind w:hanging="0" w:left="0" w:right="0"/>
@@ -13185,7 +12644,6 @@
               <w:keepNext w:val="false"/>
               <w:keepLines w:val="false"/>
               <w:widowControl w:val="false"/>
-              <w:pBdr/>
               <w:shd w:val="clear" w:fill="auto"/>
               <w:spacing w:lineRule="auto" w:line="240" w:before="0" w:after="0"/>
               <w:ind w:hanging="0" w:left="0" w:right="0"/>
@@ -13207,7 +12665,6 @@
               <w:keepNext w:val="false"/>
               <w:keepLines w:val="false"/>
               <w:widowControl w:val="false"/>
-              <w:pBdr/>
               <w:shd w:val="clear" w:fill="auto"/>
               <w:spacing w:lineRule="auto" w:line="240" w:before="0" w:after="0"/>
               <w:ind w:hanging="0" w:left="0" w:right="0"/>
@@ -13229,7 +12686,6 @@
               <w:keepNext w:val="false"/>
               <w:keepLines w:val="false"/>
               <w:widowControl w:val="false"/>
-              <w:pBdr/>
               <w:shd w:val="clear" w:fill="auto"/>
               <w:spacing w:lineRule="auto" w:line="240" w:before="0" w:after="0"/>
               <w:ind w:hanging="0" w:left="0" w:right="0"/>
@@ -13251,7 +12707,6 @@
               <w:keepNext w:val="false"/>
               <w:keepLines w:val="false"/>
               <w:widowControl w:val="false"/>
-              <w:pBdr/>
               <w:shd w:val="clear" w:fill="auto"/>
               <w:spacing w:lineRule="auto" w:line="240" w:before="0" w:after="0"/>
               <w:ind w:hanging="0" w:left="0" w:right="0"/>
@@ -13273,7 +12728,6 @@
               <w:keepNext w:val="false"/>
               <w:keepLines w:val="false"/>
               <w:widowControl w:val="false"/>
-              <w:pBdr/>
               <w:shd w:val="clear" w:fill="auto"/>
               <w:spacing w:lineRule="auto" w:line="240" w:before="0" w:after="0"/>
               <w:ind w:hanging="0" w:left="0" w:right="0"/>
@@ -13295,7 +12749,6 @@
               <w:keepNext w:val="false"/>
               <w:keepLines w:val="false"/>
               <w:widowControl w:val="false"/>
-              <w:pBdr/>
               <w:shd w:val="clear" w:fill="auto"/>
               <w:spacing w:lineRule="auto" w:line="240" w:before="0" w:after="0"/>
               <w:ind w:hanging="0" w:left="0" w:right="0"/>
@@ -13453,7 +12906,6 @@
               <w:keepNext w:val="false"/>
               <w:keepLines w:val="false"/>
               <w:widowControl w:val="false"/>
-              <w:pBdr/>
               <w:shd w:val="clear" w:fill="auto"/>
               <w:spacing w:lineRule="auto" w:line="240" w:before="0" w:after="0"/>
               <w:ind w:hanging="0" w:left="0" w:right="0"/>
@@ -13471,7 +12923,6 @@
               <w:keepNext w:val="false"/>
               <w:keepLines w:val="false"/>
               <w:widowControl w:val="false"/>
-              <w:pBdr/>
               <w:shd w:val="clear" w:fill="auto"/>
               <w:spacing w:lineRule="auto" w:line="240" w:before="0" w:after="0"/>
               <w:ind w:hanging="0" w:left="0" w:right="0"/>
@@ -13489,7 +12940,6 @@
               <w:keepNext w:val="false"/>
               <w:keepLines w:val="false"/>
               <w:widowControl w:val="false"/>
-              <w:pBdr/>
               <w:shd w:val="clear" w:fill="auto"/>
               <w:spacing w:lineRule="auto" w:line="240" w:before="0" w:after="0"/>
               <w:ind w:hanging="0" w:left="0" w:right="0"/>
@@ -13507,7 +12957,6 @@
               <w:keepNext w:val="false"/>
               <w:keepLines w:val="false"/>
               <w:widowControl w:val="false"/>
-              <w:pBdr/>
               <w:shd w:val="clear" w:fill="auto"/>
               <w:spacing w:lineRule="auto" w:line="240" w:before="0" w:after="0"/>
               <w:ind w:hanging="0" w:left="0" w:right="0"/>
@@ -13590,7 +13039,6 @@
               <w:keepNext w:val="false"/>
               <w:keepLines w:val="false"/>
               <w:widowControl w:val="false"/>
-              <w:pBdr/>
               <w:shd w:val="clear" w:fill="auto"/>
               <w:spacing w:lineRule="auto" w:line="240" w:before="0" w:after="0"/>
               <w:ind w:hanging="0" w:left="0" w:right="0"/>
@@ -13608,7 +13056,6 @@
               <w:keepNext w:val="false"/>
               <w:keepLines w:val="false"/>
               <w:widowControl w:val="false"/>
-              <w:pBdr/>
               <w:shd w:val="clear" w:fill="auto"/>
               <w:spacing w:lineRule="auto" w:line="240" w:before="0" w:after="0"/>
               <w:ind w:hanging="0" w:left="0" w:right="0"/>
@@ -13630,7 +13077,6 @@
               <w:keepNext w:val="false"/>
               <w:keepLines w:val="false"/>
               <w:widowControl w:val="false"/>
-              <w:pBdr/>
               <w:shd w:val="clear" w:fill="auto"/>
               <w:spacing w:lineRule="auto" w:line="240" w:before="0" w:after="0"/>
               <w:ind w:hanging="0" w:left="0" w:right="0"/>
@@ -13652,7 +13098,6 @@
               <w:keepNext w:val="false"/>
               <w:keepLines w:val="false"/>
               <w:widowControl w:val="false"/>
-              <w:pBdr/>
               <w:shd w:val="clear" w:fill="auto"/>
               <w:spacing w:lineRule="auto" w:line="240" w:before="0" w:after="0"/>
               <w:ind w:hanging="0" w:left="0" w:right="0"/>
@@ -13674,7 +13119,6 @@
               <w:keepNext w:val="false"/>
               <w:keepLines w:val="false"/>
               <w:widowControl w:val="false"/>
-              <w:pBdr/>
               <w:shd w:val="clear" w:fill="auto"/>
               <w:spacing w:lineRule="auto" w:line="240" w:before="0" w:after="0"/>
               <w:ind w:hanging="0" w:left="0" w:right="0"/>
@@ -13696,7 +13140,6 @@
               <w:keepNext w:val="false"/>
               <w:keepLines w:val="false"/>
               <w:widowControl w:val="false"/>
-              <w:pBdr/>
               <w:shd w:val="clear" w:fill="auto"/>
               <w:spacing w:lineRule="auto" w:line="240" w:before="0" w:after="0"/>
               <w:ind w:hanging="0" w:left="0" w:right="0"/>
@@ -13718,7 +13161,6 @@
               <w:keepNext w:val="false"/>
               <w:keepLines w:val="false"/>
               <w:widowControl w:val="false"/>
-              <w:pBdr/>
               <w:shd w:val="clear" w:fill="auto"/>
               <w:spacing w:lineRule="auto" w:line="240" w:before="0" w:after="0"/>
               <w:ind w:hanging="0" w:left="0" w:right="0"/>
@@ -13740,7 +13182,6 @@
               <w:keepNext w:val="false"/>
               <w:keepLines w:val="false"/>
               <w:widowControl w:val="false"/>
-              <w:pBdr/>
               <w:shd w:val="clear" w:fill="auto"/>
               <w:spacing w:lineRule="auto" w:line="240" w:before="0" w:after="0"/>
               <w:ind w:hanging="0" w:left="0" w:right="0"/>
@@ -13762,7 +13203,6 @@
               <w:keepNext w:val="false"/>
               <w:keepLines w:val="false"/>
               <w:widowControl w:val="false"/>
-              <w:pBdr/>
               <w:shd w:val="clear" w:fill="auto"/>
               <w:spacing w:lineRule="auto" w:line="240" w:before="0" w:after="0"/>
               <w:ind w:hanging="0" w:left="0" w:right="0"/>
@@ -13784,7 +13224,6 @@
               <w:keepNext w:val="false"/>
               <w:keepLines w:val="false"/>
               <w:widowControl w:val="false"/>
-              <w:pBdr/>
               <w:shd w:val="clear" w:fill="auto"/>
               <w:spacing w:lineRule="auto" w:line="240" w:before="0" w:after="0"/>
               <w:ind w:hanging="0" w:left="0" w:right="0"/>
@@ -13882,7 +13321,6 @@
               <w:keepNext w:val="false"/>
               <w:keepLines w:val="false"/>
               <w:widowControl w:val="false"/>
-              <w:pBdr/>
               <w:shd w:val="clear" w:fill="auto"/>
               <w:spacing w:lineRule="auto" w:line="240" w:before="0" w:after="0"/>
               <w:ind w:hanging="0" w:left="0" w:right="0"/>
@@ -13900,7 +13338,6 @@
               <w:keepNext w:val="false"/>
               <w:keepLines w:val="false"/>
               <w:widowControl w:val="false"/>
-              <w:pBdr/>
               <w:shd w:val="clear" w:fill="auto"/>
               <w:spacing w:lineRule="auto" w:line="240" w:before="0" w:after="0"/>
               <w:ind w:hanging="0" w:left="0" w:right="0"/>
@@ -13918,7 +13355,6 @@
               <w:keepNext w:val="false"/>
               <w:keepLines w:val="false"/>
               <w:widowControl w:val="false"/>
-              <w:pBdr/>
               <w:shd w:val="clear" w:fill="auto"/>
               <w:spacing w:lineRule="auto" w:line="240" w:before="0" w:after="0"/>
               <w:ind w:hanging="0" w:left="0" w:right="0"/>
@@ -13936,7 +13372,6 @@
               <w:keepNext w:val="false"/>
               <w:keepLines w:val="false"/>
               <w:widowControl w:val="false"/>
-              <w:pBdr/>
               <w:shd w:val="clear" w:fill="auto"/>
               <w:spacing w:lineRule="auto" w:line="240" w:before="0" w:after="0"/>
               <w:ind w:hanging="0" w:left="0" w:right="0"/>
@@ -14019,7 +13454,6 @@
               <w:keepNext w:val="false"/>
               <w:keepLines w:val="false"/>
               <w:widowControl w:val="false"/>
-              <w:pBdr/>
               <w:shd w:val="clear" w:fill="auto"/>
               <w:spacing w:lineRule="auto" w:line="240" w:before="0" w:after="0"/>
               <w:ind w:hanging="0" w:left="0" w:right="0"/>
@@ -14037,7 +13471,6 @@
               <w:keepNext w:val="false"/>
               <w:keepLines w:val="false"/>
               <w:widowControl w:val="false"/>
-              <w:pBdr/>
               <w:shd w:val="clear" w:fill="auto"/>
               <w:spacing w:lineRule="auto" w:line="240" w:before="0" w:after="0"/>
               <w:ind w:hanging="0" w:left="0" w:right="0"/>
@@ -14059,7 +13492,6 @@
               <w:keepNext w:val="false"/>
               <w:keepLines w:val="false"/>
               <w:widowControl w:val="false"/>
-              <w:pBdr/>
               <w:shd w:val="clear" w:fill="auto"/>
               <w:spacing w:lineRule="auto" w:line="240" w:before="0" w:after="0"/>
               <w:ind w:hanging="0" w:left="0" w:right="0"/>
@@ -14081,7 +13513,6 @@
               <w:keepNext w:val="false"/>
               <w:keepLines w:val="false"/>
               <w:widowControl w:val="false"/>
-              <w:pBdr/>
               <w:shd w:val="clear" w:fill="auto"/>
               <w:spacing w:lineRule="auto" w:line="240" w:before="0" w:after="0"/>
               <w:ind w:hanging="0" w:left="0" w:right="0"/>
@@ -14103,7 +13534,6 @@
               <w:keepNext w:val="false"/>
               <w:keepLines w:val="false"/>
               <w:widowControl w:val="false"/>
-              <w:pBdr/>
               <w:shd w:val="clear" w:fill="auto"/>
               <w:spacing w:lineRule="auto" w:line="240" w:before="0" w:after="0"/>
               <w:ind w:hanging="0" w:left="0" w:right="0"/>
@@ -14125,7 +13555,6 @@
               <w:keepNext w:val="false"/>
               <w:keepLines w:val="false"/>
               <w:widowControl w:val="false"/>
-              <w:pBdr/>
               <w:shd w:val="clear" w:fill="auto"/>
               <w:spacing w:lineRule="auto" w:line="240" w:before="0" w:after="0"/>
               <w:ind w:hanging="0" w:left="0" w:right="0"/>
@@ -14147,7 +13576,6 @@
               <w:keepNext w:val="false"/>
               <w:keepLines w:val="false"/>
               <w:widowControl w:val="false"/>
-              <w:pBdr/>
               <w:shd w:val="clear" w:fill="auto"/>
               <w:spacing w:lineRule="auto" w:line="240" w:before="0" w:after="0"/>
               <w:ind w:hanging="0" w:left="0" w:right="0"/>
@@ -14169,7 +13597,6 @@
               <w:keepNext w:val="false"/>
               <w:keepLines w:val="false"/>
               <w:widowControl w:val="false"/>
-              <w:pBdr/>
               <w:shd w:val="clear" w:fill="auto"/>
               <w:spacing w:lineRule="auto" w:line="240" w:before="0" w:after="0"/>
               <w:ind w:hanging="0" w:left="0" w:right="0"/>
@@ -14753,7 +14180,6 @@
               <w:keepNext w:val="false"/>
               <w:keepLines w:val="false"/>
               <w:widowControl w:val="false"/>
-              <w:pBdr/>
               <w:shd w:val="clear" w:fill="auto"/>
               <w:spacing w:lineRule="auto" w:line="240" w:before="0" w:after="0"/>
               <w:ind w:hanging="0" w:left="0" w:right="0"/>
@@ -14771,7 +14197,6 @@
               <w:keepNext w:val="false"/>
               <w:keepLines w:val="false"/>
               <w:widowControl w:val="false"/>
-              <w:pBdr/>
               <w:shd w:val="clear" w:fill="auto"/>
               <w:spacing w:lineRule="auto" w:line="240" w:before="0" w:after="0"/>
               <w:ind w:hanging="0" w:left="0" w:right="0"/>
@@ -14789,7 +14214,6 @@
               <w:keepNext w:val="false"/>
               <w:keepLines w:val="false"/>
               <w:widowControl w:val="false"/>
-              <w:pBdr/>
               <w:shd w:val="clear" w:fill="auto"/>
               <w:spacing w:lineRule="auto" w:line="240" w:before="0" w:after="0"/>
               <w:ind w:hanging="0" w:left="0" w:right="0"/>
@@ -14807,7 +14231,6 @@
               <w:keepNext w:val="false"/>
               <w:keepLines w:val="false"/>
               <w:widowControl w:val="false"/>
-              <w:pBdr/>
               <w:shd w:val="clear" w:fill="auto"/>
               <w:spacing w:lineRule="auto" w:line="240" w:before="0" w:after="0"/>
               <w:ind w:hanging="0" w:left="0" w:right="0"/>
@@ -14890,7 +14313,6 @@
               <w:keepNext w:val="false"/>
               <w:keepLines w:val="false"/>
               <w:widowControl w:val="false"/>
-              <w:pBdr/>
               <w:shd w:val="clear" w:fill="auto"/>
               <w:spacing w:lineRule="auto" w:line="240" w:before="0" w:after="0"/>
               <w:ind w:hanging="0" w:left="0" w:right="0"/>
@@ -14908,7 +14330,6 @@
               <w:keepNext w:val="false"/>
               <w:keepLines w:val="false"/>
               <w:widowControl w:val="false"/>
-              <w:pBdr/>
               <w:shd w:val="clear" w:fill="auto"/>
               <w:spacing w:lineRule="auto" w:line="240" w:before="0" w:after="0"/>
               <w:ind w:hanging="0" w:left="0" w:right="0"/>
@@ -14930,7 +14351,6 @@
               <w:keepNext w:val="false"/>
               <w:keepLines w:val="false"/>
               <w:widowControl w:val="false"/>
-              <w:pBdr/>
               <w:shd w:val="clear" w:fill="auto"/>
               <w:spacing w:lineRule="auto" w:line="240" w:before="0" w:after="0"/>
               <w:ind w:hanging="0" w:left="0" w:right="0"/>
@@ -14952,7 +14372,6 @@
               <w:keepNext w:val="false"/>
               <w:keepLines w:val="false"/>
               <w:widowControl w:val="false"/>
-              <w:pBdr/>
               <w:shd w:val="clear" w:fill="auto"/>
               <w:spacing w:lineRule="auto" w:line="240" w:before="0" w:after="0"/>
               <w:ind w:hanging="0" w:left="0" w:right="0"/>
@@ -14974,7 +14393,6 @@
               <w:keepNext w:val="false"/>
               <w:keepLines w:val="false"/>
               <w:widowControl w:val="false"/>
-              <w:pBdr/>
               <w:shd w:val="clear" w:fill="auto"/>
               <w:spacing w:lineRule="auto" w:line="240" w:before="0" w:after="0"/>
               <w:ind w:hanging="0" w:left="0" w:right="0"/>
@@ -14996,7 +14414,6 @@
               <w:keepNext w:val="false"/>
               <w:keepLines w:val="false"/>
               <w:widowControl w:val="false"/>
-              <w:pBdr/>
               <w:shd w:val="clear" w:fill="auto"/>
               <w:spacing w:lineRule="auto" w:line="240" w:before="0" w:after="0"/>
               <w:ind w:hanging="0" w:left="0" w:right="0"/>
@@ -15018,7 +14435,6 @@
               <w:keepNext w:val="false"/>
               <w:keepLines w:val="false"/>
               <w:widowControl w:val="false"/>
-              <w:pBdr/>
               <w:shd w:val="clear" w:fill="auto"/>
               <w:spacing w:lineRule="auto" w:line="240" w:before="0" w:after="0"/>
               <w:ind w:hanging="0" w:left="0" w:right="0"/>
@@ -15040,7 +14456,6 @@
               <w:keepNext w:val="false"/>
               <w:keepLines w:val="false"/>
               <w:widowControl w:val="false"/>
-              <w:pBdr/>
               <w:shd w:val="clear" w:fill="auto"/>
               <w:spacing w:lineRule="auto" w:line="240" w:before="0" w:after="0"/>
               <w:ind w:hanging="0" w:left="0" w:right="0"/>
@@ -15062,7 +14477,6 @@
               <w:keepNext w:val="false"/>
               <w:keepLines w:val="false"/>
               <w:widowControl w:val="false"/>
-              <w:pBdr/>
               <w:shd w:val="clear" w:fill="auto"/>
               <w:spacing w:lineRule="auto" w:line="240" w:before="0" w:after="0"/>
               <w:ind w:hanging="0" w:left="0" w:right="0"/>
@@ -15084,7 +14498,6 @@
               <w:keepNext w:val="false"/>
               <w:keepLines w:val="false"/>
               <w:widowControl w:val="false"/>
-              <w:pBdr/>
               <w:shd w:val="clear" w:fill="auto"/>
               <w:spacing w:lineRule="auto" w:line="240" w:before="0" w:after="0"/>
               <w:ind w:hanging="0" w:left="0" w:right="0"/>
@@ -15106,7 +14519,6 @@
               <w:keepNext w:val="false"/>
               <w:keepLines w:val="false"/>
               <w:widowControl w:val="false"/>
-              <w:pBdr/>
               <w:shd w:val="clear" w:fill="auto"/>
               <w:spacing w:lineRule="auto" w:line="240" w:before="0" w:after="0"/>
               <w:ind w:hanging="0" w:left="0" w:right="0"/>
@@ -15128,7 +14540,6 @@
               <w:keepNext w:val="false"/>
               <w:keepLines w:val="false"/>
               <w:widowControl w:val="false"/>
-              <w:pBdr/>
               <w:shd w:val="clear" w:fill="auto"/>
               <w:spacing w:lineRule="auto" w:line="240" w:before="0" w:after="0"/>
               <w:ind w:hanging="0" w:left="0" w:right="0"/>
@@ -15211,7 +14622,6 @@
               <w:keepNext w:val="false"/>
               <w:keepLines w:val="false"/>
               <w:widowControl w:val="false"/>
-              <w:pBdr/>
               <w:shd w:val="clear" w:fill="auto"/>
               <w:spacing w:lineRule="auto" w:line="240" w:before="0" w:after="0"/>
               <w:ind w:hanging="0" w:left="0" w:right="0"/>
@@ -15229,7 +14639,6 @@
               <w:keepNext w:val="false"/>
               <w:keepLines w:val="false"/>
               <w:widowControl w:val="false"/>
-              <w:pBdr/>
               <w:shd w:val="clear" w:fill="auto"/>
               <w:spacing w:lineRule="auto" w:line="240" w:before="0" w:after="0"/>
               <w:ind w:hanging="0" w:left="0" w:right="0"/>
@@ -15247,7 +14656,6 @@
               <w:keepNext w:val="false"/>
               <w:keepLines w:val="false"/>
               <w:widowControl w:val="false"/>
-              <w:pBdr/>
               <w:shd w:val="clear" w:fill="auto"/>
               <w:spacing w:lineRule="auto" w:line="240" w:before="0" w:after="0"/>
               <w:ind w:hanging="0" w:left="0" w:right="0"/>
@@ -15265,7 +14673,6 @@
               <w:keepNext w:val="false"/>
               <w:keepLines w:val="false"/>
               <w:widowControl w:val="false"/>
-              <w:pBdr/>
               <w:shd w:val="clear" w:fill="auto"/>
               <w:spacing w:lineRule="auto" w:line="240" w:before="0" w:after="0"/>
               <w:ind w:hanging="0" w:left="0" w:right="0"/>
@@ -15298,7 +14705,6 @@
               <w:keepNext w:val="false"/>
               <w:keepLines w:val="false"/>
               <w:widowControl w:val="false"/>
-              <w:pBdr/>
               <w:shd w:val="clear" w:fill="auto"/>
               <w:spacing w:lineRule="auto" w:line="240" w:before="0" w:after="0"/>
               <w:ind w:hanging="0" w:left="0" w:right="0"/>
@@ -15316,7 +14722,6 @@
               <w:keepNext w:val="false"/>
               <w:keepLines w:val="false"/>
               <w:widowControl w:val="false"/>
-              <w:pBdr/>
               <w:shd w:val="clear" w:fill="auto"/>
               <w:spacing w:lineRule="auto" w:line="240" w:before="0" w:after="0"/>
               <w:ind w:hanging="0" w:left="0" w:right="0"/>
@@ -15338,7 +14743,6 @@
               <w:keepNext w:val="false"/>
               <w:keepLines w:val="false"/>
               <w:widowControl w:val="false"/>
-              <w:pBdr/>
               <w:shd w:val="clear" w:fill="auto"/>
               <w:spacing w:lineRule="auto" w:line="240" w:before="0" w:after="0"/>
               <w:ind w:hanging="0" w:left="0" w:right="0"/>
@@ -15360,7 +14764,6 @@
               <w:keepNext w:val="false"/>
               <w:keepLines w:val="false"/>
               <w:widowControl w:val="false"/>
-              <w:pBdr/>
               <w:shd w:val="clear" w:fill="auto"/>
               <w:spacing w:lineRule="auto" w:line="240" w:before="0" w:after="0"/>
               <w:ind w:hanging="0" w:left="0" w:right="0"/>
@@ -15382,7 +14785,6 @@
               <w:keepNext w:val="false"/>
               <w:keepLines w:val="false"/>
               <w:widowControl w:val="false"/>
-              <w:pBdr/>
               <w:shd w:val="clear" w:fill="auto"/>
               <w:spacing w:lineRule="auto" w:line="240" w:before="0" w:after="0"/>
               <w:ind w:hanging="0" w:left="0" w:right="0"/>
@@ -15480,7 +14882,6 @@
               <w:keepNext w:val="false"/>
               <w:keepLines w:val="false"/>
               <w:widowControl w:val="false"/>
-              <w:pBdr/>
               <w:shd w:val="clear" w:fill="auto"/>
               <w:spacing w:lineRule="auto" w:line="240" w:before="0" w:after="0"/>
               <w:ind w:hanging="0" w:left="0" w:right="0"/>
@@ -15498,7 +14899,6 @@
               <w:keepNext w:val="false"/>
               <w:keepLines w:val="false"/>
               <w:widowControl w:val="false"/>
-              <w:pBdr/>
               <w:shd w:val="clear" w:fill="auto"/>
               <w:spacing w:lineRule="auto" w:line="240" w:before="0" w:after="0"/>
               <w:ind w:hanging="0" w:left="0" w:right="0"/>
@@ -15516,7 +14916,6 @@
               <w:keepNext w:val="false"/>
               <w:keepLines w:val="false"/>
               <w:widowControl w:val="false"/>
-              <w:pBdr/>
               <w:shd w:val="clear" w:fill="auto"/>
               <w:spacing w:lineRule="auto" w:line="240" w:before="0" w:after="0"/>
               <w:ind w:hanging="0" w:left="0" w:right="0"/>
@@ -15534,7 +14933,6 @@
               <w:keepNext w:val="false"/>
               <w:keepLines w:val="false"/>
               <w:widowControl w:val="false"/>
-              <w:pBdr/>
               <w:shd w:val="clear" w:fill="auto"/>
               <w:spacing w:lineRule="auto" w:line="240" w:before="0" w:after="0"/>
               <w:ind w:hanging="0" w:left="0" w:right="0"/>
@@ -15667,7 +15065,6 @@
               <w:keepNext w:val="false"/>
               <w:keepLines w:val="false"/>
               <w:widowControl w:val="false"/>
-              <w:pBdr/>
               <w:shd w:val="clear" w:fill="auto"/>
               <w:spacing w:lineRule="auto" w:line="240" w:before="0" w:after="0"/>
               <w:ind w:hanging="0" w:left="0" w:right="0"/>
@@ -15685,7 +15082,6 @@
               <w:keepNext w:val="false"/>
               <w:keepLines w:val="false"/>
               <w:widowControl w:val="false"/>
-              <w:pBdr/>
               <w:shd w:val="clear" w:fill="auto"/>
               <w:spacing w:lineRule="auto" w:line="240" w:before="0" w:after="0"/>
               <w:ind w:hanging="0" w:left="0" w:right="0"/>
@@ -15707,7 +15103,6 @@
               <w:keepNext w:val="false"/>
               <w:keepLines w:val="false"/>
               <w:widowControl w:val="false"/>
-              <w:pBdr/>
               <w:shd w:val="clear" w:fill="auto"/>
               <w:spacing w:lineRule="auto" w:line="240" w:before="0" w:after="0"/>
               <w:ind w:hanging="0" w:left="0" w:right="0"/>
@@ -15729,7 +15124,6 @@
               <w:keepNext w:val="false"/>
               <w:keepLines w:val="false"/>
               <w:widowControl w:val="false"/>
-              <w:pBdr/>
               <w:shd w:val="clear" w:fill="auto"/>
               <w:spacing w:lineRule="auto" w:line="240" w:before="0" w:after="0"/>
               <w:ind w:hanging="0" w:left="0" w:right="0"/>
@@ -15751,7 +15145,6 @@
               <w:keepNext w:val="false"/>
               <w:keepLines w:val="false"/>
               <w:widowControl w:val="false"/>
-              <w:pBdr/>
               <w:shd w:val="clear" w:fill="auto"/>
               <w:spacing w:lineRule="auto" w:line="240" w:before="0" w:after="0"/>
               <w:ind w:hanging="0" w:left="0" w:right="0"/>
@@ -15773,7 +15166,6 @@
               <w:keepNext w:val="false"/>
               <w:keepLines w:val="false"/>
               <w:widowControl w:val="false"/>
-              <w:pBdr/>
               <w:shd w:val="clear" w:fill="auto"/>
               <w:spacing w:lineRule="auto" w:line="240" w:before="0" w:after="0"/>
               <w:ind w:hanging="0" w:left="0" w:right="0"/>
@@ -15795,7 +15187,6 @@
               <w:keepNext w:val="false"/>
               <w:keepLines w:val="false"/>
               <w:widowControl w:val="false"/>
-              <w:pBdr/>
               <w:shd w:val="clear" w:fill="auto"/>
               <w:spacing w:lineRule="auto" w:line="240" w:before="0" w:after="0"/>
               <w:ind w:hanging="0" w:left="0" w:right="0"/>
@@ -15817,7 +15208,6 @@
               <w:keepNext w:val="false"/>
               <w:keepLines w:val="false"/>
               <w:widowControl w:val="false"/>
-              <w:pBdr/>
               <w:shd w:val="clear" w:fill="auto"/>
               <w:spacing w:lineRule="auto" w:line="240" w:before="0" w:after="0"/>
               <w:ind w:hanging="0" w:left="0" w:right="0"/>
@@ -15839,7 +15229,6 @@
               <w:keepNext w:val="false"/>
               <w:keepLines w:val="false"/>
               <w:widowControl w:val="false"/>
-              <w:pBdr/>
               <w:shd w:val="clear" w:fill="auto"/>
               <w:spacing w:lineRule="auto" w:line="240" w:before="0" w:after="0"/>
               <w:ind w:hanging="0" w:left="0" w:right="0"/>
@@ -15861,7 +15250,6 @@
               <w:keepNext w:val="false"/>
               <w:keepLines w:val="false"/>
               <w:widowControl w:val="false"/>
-              <w:pBdr/>
               <w:shd w:val="clear" w:fill="auto"/>
               <w:spacing w:lineRule="auto" w:line="240" w:before="0" w:after="0"/>
               <w:ind w:hanging="0" w:left="0" w:right="0"/>
@@ -16039,7 +15427,6 @@
               <w:keepNext w:val="false"/>
               <w:keepLines w:val="false"/>
               <w:widowControl w:val="false"/>
-              <w:pBdr/>
               <w:shd w:val="clear" w:fill="auto"/>
               <w:spacing w:lineRule="auto" w:line="240" w:before="0" w:after="0"/>
               <w:ind w:hanging="0" w:left="0" w:right="0"/>
@@ -16057,7 +15444,6 @@
               <w:keepNext w:val="false"/>
               <w:keepLines w:val="false"/>
               <w:widowControl w:val="false"/>
-              <w:pBdr/>
               <w:shd w:val="clear" w:fill="auto"/>
               <w:spacing w:lineRule="auto" w:line="240" w:before="0" w:after="0"/>
               <w:ind w:hanging="0" w:left="0" w:right="0"/>
@@ -16079,7 +15465,6 @@
               <w:keepNext w:val="false"/>
               <w:keepLines w:val="false"/>
               <w:widowControl w:val="false"/>
-              <w:pBdr/>
               <w:shd w:val="clear" w:fill="auto"/>
               <w:spacing w:lineRule="auto" w:line="240" w:before="0" w:after="0"/>
               <w:ind w:hanging="0" w:left="0" w:right="0"/>
@@ -16165,7 +15550,9 @@
         </w:rPr>
       </w:pPr>
       <w:r>
-        <w:rPr/>
+        <w:rPr>
+          <w:b/>
+        </w:rPr>
       </w:r>
     </w:p>
     <w:p>
@@ -16196,7 +15583,7 @@
           <wp:inline distT="0" distB="0" distL="0" distR="0">
             <wp:extent cx="5731510" cy="1358900"/>
             <wp:effectExtent l="0" t="0" r="0" b="0"/>
-            <wp:docPr id="3" name="image2.png" descr=""/>
+            <wp:docPr id="2" name="image2.png" descr=""/>
             <wp:cNvGraphicFramePr>
               <a:graphicFrameLocks xmlns:a="http://schemas.openxmlformats.org/drawingml/2006/main" noChangeAspect="1"/>
             </wp:cNvGraphicFramePr>
@@ -16204,13 +15591,13 @@
               <a:graphicData uri="http://schemas.openxmlformats.org/drawingml/2006/picture">
                 <pic:pic xmlns:pic="http://schemas.openxmlformats.org/drawingml/2006/picture">
                   <pic:nvPicPr>
-                    <pic:cNvPr id="3" name="image2.png" descr=""/>
+                    <pic:cNvPr id="2" name="image2.png" descr=""/>
                     <pic:cNvPicPr>
                       <a:picLocks noChangeAspect="1" noChangeArrowheads="1"/>
                     </pic:cNvPicPr>
                   </pic:nvPicPr>
                   <pic:blipFill>
-                    <a:blip r:embed="rId6"/>
+                    <a:blip r:embed="rId5"/>
                     <a:stretch>
                       <a:fillRect/>
                     </a:stretch>
@@ -18230,6 +17617,7 @@
     <w:qFormat/>
     <w:pPr>
       <w:widowControl/>
+      <w:suppressAutoHyphens w:val="true"/>
       <w:bidi w:val="0"/>
       <w:spacing w:lineRule="auto" w:line="276" w:before="0" w:after="0"/>
       <w:jc w:val="left"/>
@@ -18416,6 +17804,7 @@
     <w:qFormat/>
     <w:pPr>
       <w:widowControl/>
+      <w:suppressAutoHyphens w:val="true"/>
       <w:bidi w:val="0"/>
       <w:spacing w:lineRule="auto" w:line="276" w:before="0" w:after="0"/>
       <w:jc w:val="left"/>

</xml_diff>